<commit_message>
[SAFRAN-1240] E-BookStore M2Doc 4.0.0 database and graal template migration
migration of DataBase and GraalSystemAndReq

[SAFRAN-1240]
</commit_message>
<xml_diff>
--- a/samples/plugins/org.obeonetwork.is.samples/contents/E-BookStore/documentation/doc-src/E-BookStore_DataBase_template.docx
+++ b/samples/plugins/org.obeonetwork.is.samples/contents/E-BookStore/documentation/doc-src/E-BookStore_DataBase_template.docx
@@ -376,25 +376,13 @@
         <w:rPr>
           <w:sz w:val="36"/>
         </w:rPr>
-        <w:fldChar w:fldCharType="begin"/>
+        <w:t>{m</w:t>
       </w:r>
       <w:r>
         <w:rPr>
           <w:sz w:val="36"/>
         </w:rPr>
-        <w:instrText>m</w:instrText>
-      </w:r>
-      <w:r>
-        <w:rPr>
-          <w:sz w:val="36"/>
-        </w:rPr>
-        <w:instrText>:author</w:instrText>
-      </w:r>
-      <w:r>
-        <w:rPr>
-          <w:sz w:val="36"/>
-        </w:rPr>
-        <w:fldChar w:fldCharType="end"/>
+        <w:t>:author}</w:t>
       </w:r>
     </w:p>
     <w:p>
@@ -428,13 +416,7 @@
         <w:jc w:val="center"/>
       </w:pPr>
       <w:r>
-        <w:fldChar w:fldCharType="begin"/>
-      </w:r>
-      <w:r>
-        <w:instrText>m:projectName</w:instrText>
-      </w:r>
-      <w:r>
-        <w:fldChar w:fldCharType="end"/>
+        <w:t>{m:projectName}</w:t>
       </w:r>
     </w:p>
     <w:bookmarkEnd w:id="0"/>
@@ -471,13 +453,7 @@
         <w:t xml:space="preserve">Version : </w:t>
       </w:r>
       <w:r>
-        <w:fldChar w:fldCharType="begin"/>
-      </w:r>
-      <w:r>
-        <w:instrText>m:projectVersion</w:instrText>
-      </w:r>
-      <w:r>
-        <w:fldChar w:fldCharType="end"/>
+        <w:t>{m:projectVersion}</w:t>
       </w:r>
     </w:p>
     <w:p>
@@ -2516,42 +2492,28 @@
                 <w:rFonts w:ascii="Arial" w:hAnsi="Arial" w:cs="Arial"/>
                 <w:bCs/>
               </w:rPr>
-              <w:fldChar w:fldCharType="begin"/>
-            </w:r>
-            <w:r>
-              <w:rPr>
-                <w:rFonts w:ascii="Arial" w:hAnsi="Arial" w:cs="Arial"/>
-                <w:bCs/>
-              </w:rPr>
-              <w:instrText>m:</w:instrText>
-            </w:r>
-            <w:r>
-              <w:rPr>
-                <w:rFonts w:ascii="Arial" w:hAnsi="Arial" w:cs="Arial"/>
-                <w:bCs/>
-              </w:rPr>
-              <w:instrText>db</w:instrText>
-            </w:r>
-            <w:r>
-              <w:rPr>
-                <w:rFonts w:ascii="Arial" w:hAnsi="Arial" w:cs="Arial"/>
-                <w:bCs/>
-              </w:rPr>
-              <w:instrText>.</w:instrText>
-            </w:r>
-            <w:r>
-              <w:rPr>
-                <w:rFonts w:ascii="Arial" w:hAnsi="Arial" w:cs="Arial"/>
-                <w:bCs/>
-              </w:rPr>
-              <w:instrText>typeLibraryName()</w:instrText>
-            </w:r>
-            <w:r>
-              <w:rPr>
-                <w:rFonts w:ascii="Arial" w:hAnsi="Arial" w:cs="Arial"/>
-                <w:bCs/>
-              </w:rPr>
-              <w:fldChar w:fldCharType="end"/>
+              <w:t>{m:</w:t>
+            </w:r>
+            <w:r>
+              <w:rPr>
+                <w:rFonts w:ascii="Arial" w:hAnsi="Arial" w:cs="Arial"/>
+                <w:bCs/>
+              </w:rPr>
+              <w:t>db</w:t>
+            </w:r>
+            <w:r>
+              <w:rPr>
+                <w:rFonts w:ascii="Arial" w:hAnsi="Arial" w:cs="Arial"/>
+                <w:bCs/>
+              </w:rPr>
+              <w:t>.</w:t>
+            </w:r>
+            <w:r>
+              <w:rPr>
+                <w:rFonts w:ascii="Arial" w:hAnsi="Arial" w:cs="Arial"/>
+                <w:bCs/>
+              </w:rPr>
+              <w:t>typeLibraryName()}</w:t>
             </w:r>
           </w:p>
         </w:tc>
@@ -2593,42 +2555,28 @@
                 <w:rFonts w:ascii="Arial" w:hAnsi="Arial" w:cs="Arial"/>
                 <w:bCs/>
               </w:rPr>
-              <w:fldChar w:fldCharType="begin"/>
-            </w:r>
-            <w:r>
-              <w:rPr>
-                <w:rFonts w:ascii="Arial" w:hAnsi="Arial" w:cs="Arial"/>
-                <w:bCs/>
-              </w:rPr>
-              <w:instrText>m:</w:instrText>
-            </w:r>
-            <w:r>
-              <w:rPr>
-                <w:rFonts w:ascii="Arial" w:hAnsi="Arial" w:cs="Arial"/>
-                <w:bCs/>
-              </w:rPr>
-              <w:instrText>db</w:instrText>
-            </w:r>
-            <w:r>
-              <w:rPr>
-                <w:rFonts w:ascii="Arial" w:hAnsi="Arial" w:cs="Arial"/>
-                <w:bCs/>
-              </w:rPr>
-              <w:instrText>.</w:instrText>
-            </w:r>
-            <w:r>
-              <w:rPr>
-                <w:rFonts w:ascii="Arial" w:hAnsi="Arial" w:cs="Arial"/>
-                <w:bCs/>
-              </w:rPr>
-              <w:instrText>ID</w:instrText>
-            </w:r>
-            <w:r>
-              <w:rPr>
-                <w:rFonts w:ascii="Arial" w:hAnsi="Arial" w:cs="Arial"/>
-                <w:bCs/>
-              </w:rPr>
-              <w:fldChar w:fldCharType="end"/>
+              <w:t>{m:</w:t>
+            </w:r>
+            <w:r>
+              <w:rPr>
+                <w:rFonts w:ascii="Arial" w:hAnsi="Arial" w:cs="Arial"/>
+                <w:bCs/>
+              </w:rPr>
+              <w:t>db</w:t>
+            </w:r>
+            <w:r>
+              <w:rPr>
+                <w:rFonts w:ascii="Arial" w:hAnsi="Arial" w:cs="Arial"/>
+                <w:bCs/>
+              </w:rPr>
+              <w:t>.</w:t>
+            </w:r>
+            <w:r>
+              <w:rPr>
+                <w:rFonts w:ascii="Arial" w:hAnsi="Arial" w:cs="Arial"/>
+                <w:bCs/>
+              </w:rPr>
+              <w:t>ID}</w:t>
             </w:r>
           </w:p>
         </w:tc>
@@ -2672,42 +2620,28 @@
                 <w:rFonts w:ascii="Arial" w:hAnsi="Arial" w:cs="Arial"/>
                 <w:bCs/>
               </w:rPr>
-              <w:fldChar w:fldCharType="begin"/>
-            </w:r>
-            <w:r>
-              <w:rPr>
-                <w:rFonts w:ascii="Arial" w:hAnsi="Arial" w:cs="Arial"/>
-                <w:bCs/>
-              </w:rPr>
-              <w:instrText>m:</w:instrText>
-            </w:r>
-            <w:r>
-              <w:rPr>
-                <w:rFonts w:ascii="Arial" w:hAnsi="Arial" w:cs="Arial"/>
-                <w:bCs/>
-              </w:rPr>
-              <w:instrText>db</w:instrText>
-            </w:r>
-            <w:r>
-              <w:rPr>
-                <w:rFonts w:ascii="Arial" w:hAnsi="Arial" w:cs="Arial"/>
-                <w:bCs/>
-              </w:rPr>
-              <w:instrText>.</w:instrText>
-            </w:r>
-            <w:r>
-              <w:rPr>
-                <w:rFonts w:ascii="Arial" w:hAnsi="Arial" w:cs="Arial"/>
-                <w:bCs/>
-              </w:rPr>
-              <w:instrText>techID</w:instrText>
-            </w:r>
-            <w:r>
-              <w:rPr>
-                <w:rFonts w:ascii="Arial" w:hAnsi="Arial" w:cs="Arial"/>
-                <w:bCs/>
-              </w:rPr>
-              <w:fldChar w:fldCharType="end"/>
+              <w:t>{m:</w:t>
+            </w:r>
+            <w:r>
+              <w:rPr>
+                <w:rFonts w:ascii="Arial" w:hAnsi="Arial" w:cs="Arial"/>
+                <w:bCs/>
+              </w:rPr>
+              <w:t>db</w:t>
+            </w:r>
+            <w:r>
+              <w:rPr>
+                <w:rFonts w:ascii="Arial" w:hAnsi="Arial" w:cs="Arial"/>
+                <w:bCs/>
+              </w:rPr>
+              <w:t>.</w:t>
+            </w:r>
+            <w:r>
+              <w:rPr>
+                <w:rFonts w:ascii="Arial" w:hAnsi="Arial" w:cs="Arial"/>
+                <w:bCs/>
+              </w:rPr>
+              <w:t>techID}</w:t>
             </w:r>
           </w:p>
         </w:tc>
@@ -2751,28 +2685,14 @@
                 <w:rFonts w:ascii="Arial" w:hAnsi="Arial" w:cs="Arial"/>
                 <w:bCs/>
               </w:rPr>
-              <w:fldChar w:fldCharType="begin"/>
-            </w:r>
-            <w:r>
-              <w:rPr>
-                <w:rFonts w:ascii="Arial" w:hAnsi="Arial" w:cs="Arial"/>
-                <w:bCs/>
-              </w:rPr>
-              <w:instrText>m:</w:instrText>
-            </w:r>
-            <w:r>
-              <w:rPr>
-                <w:rFonts w:ascii="Arial" w:hAnsi="Arial" w:cs="Arial"/>
-                <w:bCs/>
-              </w:rPr>
-              <w:instrText>db.defines</w:instrText>
-            </w:r>
-            <w:r>
-              <w:rPr>
-                <w:rFonts w:ascii="Arial" w:hAnsi="Arial" w:cs="Arial"/>
-                <w:bCs/>
-              </w:rPr>
-              <w:fldChar w:fldCharType="end"/>
+              <w:t>{m:</w:t>
+            </w:r>
+            <w:r>
+              <w:rPr>
+                <w:rFonts w:ascii="Arial" w:hAnsi="Arial" w:cs="Arial"/>
+                <w:bCs/>
+              </w:rPr>
+              <w:t>db.defines}</w:t>
             </w:r>
           </w:p>
           <w:p>
@@ -2825,42 +2745,28 @@
                 <w:rFonts w:ascii="Arial" w:hAnsi="Arial" w:cs="Arial"/>
                 <w:bCs/>
               </w:rPr>
-              <w:fldChar w:fldCharType="begin"/>
-            </w:r>
-            <w:r>
-              <w:rPr>
-                <w:rFonts w:ascii="Arial" w:hAnsi="Arial" w:cs="Arial"/>
-                <w:bCs/>
-              </w:rPr>
-              <w:instrText>m:</w:instrText>
-            </w:r>
-            <w:r>
-              <w:rPr>
-                <w:rFonts w:ascii="Arial" w:hAnsi="Arial" w:cs="Arial"/>
-                <w:bCs/>
-              </w:rPr>
-              <w:instrText>db</w:instrText>
-            </w:r>
-            <w:r>
-              <w:rPr>
-                <w:rFonts w:ascii="Arial" w:hAnsi="Arial" w:cs="Arial"/>
-                <w:bCs/>
-              </w:rPr>
-              <w:instrText>.</w:instrText>
-            </w:r>
-            <w:r>
-              <w:rPr>
-                <w:rFonts w:ascii="Arial" w:hAnsi="Arial" w:cs="Arial"/>
-                <w:bCs/>
-              </w:rPr>
-              <w:instrText>url</w:instrText>
-            </w:r>
-            <w:r>
-              <w:rPr>
-                <w:rFonts w:ascii="Arial" w:hAnsi="Arial" w:cs="Arial"/>
-                <w:bCs/>
-              </w:rPr>
-              <w:fldChar w:fldCharType="end"/>
+              <w:t>{m:</w:t>
+            </w:r>
+            <w:r>
+              <w:rPr>
+                <w:rFonts w:ascii="Arial" w:hAnsi="Arial" w:cs="Arial"/>
+                <w:bCs/>
+              </w:rPr>
+              <w:t>db</w:t>
+            </w:r>
+            <w:r>
+              <w:rPr>
+                <w:rFonts w:ascii="Arial" w:hAnsi="Arial" w:cs="Arial"/>
+                <w:bCs/>
+              </w:rPr>
+              <w:t>.</w:t>
+            </w:r>
+            <w:r>
+              <w:rPr>
+                <w:rFonts w:ascii="Arial" w:hAnsi="Arial" w:cs="Arial"/>
+                <w:bCs/>
+              </w:rPr>
+              <w:t>url}</w:t>
             </w:r>
           </w:p>
         </w:tc>
@@ -2902,42 +2808,28 @@
                 <w:rFonts w:ascii="Arial" w:hAnsi="Arial" w:cs="Arial"/>
                 <w:bCs/>
               </w:rPr>
-              <w:fldChar w:fldCharType="begin"/>
-            </w:r>
-            <w:r>
-              <w:rPr>
-                <w:rFonts w:ascii="Arial" w:hAnsi="Arial" w:cs="Arial"/>
-                <w:bCs/>
-              </w:rPr>
-              <w:instrText>m:</w:instrText>
-            </w:r>
-            <w:r>
-              <w:rPr>
-                <w:rFonts w:ascii="Arial" w:hAnsi="Arial" w:cs="Arial"/>
-                <w:bCs/>
-              </w:rPr>
-              <w:instrText>db</w:instrText>
-            </w:r>
-            <w:r>
-              <w:rPr>
-                <w:rFonts w:ascii="Arial" w:hAnsi="Arial" w:cs="Arial"/>
-                <w:bCs/>
-              </w:rPr>
-              <w:instrText>.</w:instrText>
-            </w:r>
-            <w:r>
-              <w:rPr>
-                <w:rFonts w:ascii="Arial" w:hAnsi="Arial" w:cs="Arial"/>
-                <w:bCs/>
-              </w:rPr>
-              <w:instrText>comments</w:instrText>
-            </w:r>
-            <w:r>
-              <w:rPr>
-                <w:rFonts w:ascii="Arial" w:hAnsi="Arial" w:cs="Arial"/>
-                <w:bCs/>
-              </w:rPr>
-              <w:fldChar w:fldCharType="end"/>
+              <w:t>{m:</w:t>
+            </w:r>
+            <w:r>
+              <w:rPr>
+                <w:rFonts w:ascii="Arial" w:hAnsi="Arial" w:cs="Arial"/>
+                <w:bCs/>
+              </w:rPr>
+              <w:t>db</w:t>
+            </w:r>
+            <w:r>
+              <w:rPr>
+                <w:rFonts w:ascii="Arial" w:hAnsi="Arial" w:cs="Arial"/>
+                <w:bCs/>
+              </w:rPr>
+              <w:t>.</w:t>
+            </w:r>
+            <w:r>
+              <w:rPr>
+                <w:rFonts w:ascii="Arial" w:hAnsi="Arial" w:cs="Arial"/>
+                <w:bCs/>
+              </w:rPr>
+              <w:t>comments}</w:t>
             </w:r>
           </w:p>
         </w:tc>
@@ -3014,7 +2906,7 @@
                 <w:sz w:val="24"/>
                 <w:szCs w:val="24"/>
               </w:rPr>
-              <w:fldChar w:fldCharType="begin"/>
+              <w:t>{m: db.asImageByRepresentationDescriptionName('Database Diagram')</w:t>
             </w:r>
             <w:r>
               <w:rPr>
@@ -3022,7 +2914,7 @@
                 <w:sz w:val="24"/>
                 <w:szCs w:val="24"/>
               </w:rPr>
-              <w:instrText>m: db.asImageByRepresentationDescriptionName('Database Diagram')</w:instrText>
+              <w:t>-&gt;first()</w:t>
             </w:r>
             <w:r>
               <w:rPr>
@@ -3030,7 +2922,7 @@
                 <w:sz w:val="24"/>
                 <w:szCs w:val="24"/>
               </w:rPr>
-              <w:instrText>-&gt;first()</w:instrText>
+              <w:t>.setConserveRatio(true)</w:t>
             </w:r>
             <w:r>
               <w:rPr>
@@ -3038,23 +2930,7 @@
                 <w:sz w:val="24"/>
                 <w:szCs w:val="24"/>
               </w:rPr>
-              <w:instrText>.setConserveRatio(true)</w:instrText>
-            </w:r>
-            <w:r>
-              <w:rPr>
-                <w:noProof/>
-                <w:sz w:val="24"/>
-                <w:szCs w:val="24"/>
-              </w:rPr>
-              <w:instrText>.setWidth(200)</w:instrText>
-            </w:r>
-            <w:r>
-              <w:rPr>
-                <w:noProof/>
-                <w:sz w:val="24"/>
-                <w:szCs w:val="24"/>
-              </w:rPr>
-              <w:fldChar w:fldCharType="end"/>
+              <w:t>.setWidth(200)}</w:t>
             </w:r>
             <w:r>
               <w:rPr>
@@ -3194,49 +3070,35 @@
           <w:rFonts w:ascii="Arial" w:hAnsi="Arial" w:cs="Arial"/>
           <w:bCs/>
         </w:rPr>
-        <w:fldChar w:fldCharType="begin"/>
+        <w:t>{m</w:t>
       </w:r>
       <w:r>
         <w:rPr>
           <w:rFonts w:ascii="Arial" w:hAnsi="Arial" w:cs="Arial"/>
           <w:bCs/>
         </w:rPr>
-        <w:instrText>m</w:instrText>
+        <w:t xml:space="preserve">:for </w:t>
       </w:r>
       <w:r>
         <w:rPr>
           <w:rFonts w:ascii="Arial" w:hAnsi="Arial" w:cs="Arial"/>
           <w:bCs/>
         </w:rPr>
-        <w:instrText xml:space="preserve">:for </w:instrText>
+        <w:t>schema</w:t>
       </w:r>
       <w:r>
         <w:rPr>
           <w:rFonts w:ascii="Arial" w:hAnsi="Arial" w:cs="Arial"/>
           <w:bCs/>
         </w:rPr>
-        <w:instrText>schema</w:instrText>
+        <w:t xml:space="preserve"> | db.</w:t>
       </w:r>
       <w:r>
         <w:rPr>
           <w:rFonts w:ascii="Arial" w:hAnsi="Arial" w:cs="Arial"/>
           <w:bCs/>
         </w:rPr>
-        <w:instrText xml:space="preserve"> | db.</w:instrText>
-      </w:r>
-      <w:r>
-        <w:rPr>
-          <w:rFonts w:ascii="Arial" w:hAnsi="Arial" w:cs="Arial"/>
-          <w:bCs/>
-        </w:rPr>
-        <w:instrText>schemas</w:instrText>
-      </w:r>
-      <w:r>
-        <w:rPr>
-          <w:rFonts w:ascii="Arial" w:hAnsi="Arial" w:cs="Arial"/>
-          <w:bCs/>
-        </w:rPr>
-        <w:fldChar w:fldCharType="end"/>
+        <w:t>schemas}</w:t>
       </w:r>
     </w:p>
     <w:tbl>
@@ -3271,35 +3133,21 @@
                 <w:rFonts w:ascii="Arial" w:hAnsi="Arial" w:cs="Arial"/>
                 <w:bCs/>
               </w:rPr>
-              <w:fldChar w:fldCharType="begin"/>
-            </w:r>
-            <w:r>
-              <w:rPr>
-                <w:rFonts w:ascii="Arial" w:hAnsi="Arial" w:cs="Arial"/>
-                <w:bCs/>
-              </w:rPr>
-              <w:instrText>m:</w:instrText>
-            </w:r>
-            <w:r>
-              <w:rPr>
-                <w:rFonts w:ascii="Arial" w:hAnsi="Arial" w:cs="Arial"/>
-                <w:bCs/>
-              </w:rPr>
-              <w:instrText>schema</w:instrText>
-            </w:r>
-            <w:r>
-              <w:rPr>
-                <w:rFonts w:ascii="Arial" w:hAnsi="Arial" w:cs="Arial"/>
-                <w:bCs/>
-              </w:rPr>
-              <w:instrText>.name</w:instrText>
-            </w:r>
-            <w:r>
-              <w:rPr>
-                <w:rFonts w:ascii="Arial" w:hAnsi="Arial" w:cs="Arial"/>
-                <w:bCs/>
-              </w:rPr>
-              <w:fldChar w:fldCharType="end"/>
+              <w:t>{m:</w:t>
+            </w:r>
+            <w:r>
+              <w:rPr>
+                <w:rFonts w:ascii="Arial" w:hAnsi="Arial" w:cs="Arial"/>
+                <w:bCs/>
+              </w:rPr>
+              <w:t>schema</w:t>
+            </w:r>
+            <w:r>
+              <w:rPr>
+                <w:rFonts w:ascii="Arial" w:hAnsi="Arial" w:cs="Arial"/>
+                <w:bCs/>
+              </w:rPr>
+              <w:t>.name}</w:t>
             </w:r>
           </w:p>
         </w:tc>
@@ -3323,28 +3171,14 @@
                 <w:rFonts w:ascii="Arial" w:hAnsi="Arial" w:cs="Arial"/>
                 <w:bCs/>
               </w:rPr>
-              <w:fldChar w:fldCharType="begin"/>
-            </w:r>
-            <w:r>
-              <w:rPr>
-                <w:rFonts w:ascii="Arial" w:hAnsi="Arial" w:cs="Arial"/>
-                <w:bCs/>
-              </w:rPr>
-              <w:instrText>m:</w:instrText>
-            </w:r>
-            <w:r>
-              <w:rPr>
-                <w:rFonts w:ascii="Arial" w:hAnsi="Arial" w:cs="Arial"/>
-                <w:bCs/>
-              </w:rPr>
-              <w:instrText>schema.comments</w:instrText>
-            </w:r>
-            <w:r>
-              <w:rPr>
-                <w:rFonts w:ascii="Arial" w:hAnsi="Arial" w:cs="Arial"/>
-                <w:bCs/>
-              </w:rPr>
-              <w:fldChar w:fldCharType="end"/>
+              <w:t>{m:</w:t>
+            </w:r>
+            <w:r>
+              <w:rPr>
+                <w:rFonts w:ascii="Arial" w:hAnsi="Arial" w:cs="Arial"/>
+                <w:bCs/>
+              </w:rPr>
+              <w:t>schema.comments}</w:t>
             </w:r>
           </w:p>
         </w:tc>
@@ -3366,21 +3200,7 @@
           <w:rFonts w:ascii="Arial" w:hAnsi="Arial" w:cs="Arial"/>
           <w:bCs/>
         </w:rPr>
-        <w:fldChar w:fldCharType="begin"/>
-      </w:r>
-      <w:r>
-        <w:rPr>
-          <w:rFonts w:ascii="Arial" w:hAnsi="Arial" w:cs="Arial"/>
-          <w:bCs/>
-        </w:rPr>
-        <w:instrText xml:space="preserve">m:endfor </w:instrText>
-      </w:r>
-      <w:r>
-        <w:rPr>
-          <w:rFonts w:ascii="Arial" w:hAnsi="Arial" w:cs="Arial"/>
-          <w:bCs/>
-        </w:rPr>
-        <w:fldChar w:fldCharType="end"/>
+        <w:t xml:space="preserve">{m:endfor}</w:t>
       </w:r>
     </w:p>
     <w:p>
@@ -3520,56 +3340,42 @@
           <w:rFonts w:ascii="Arial" w:hAnsi="Arial" w:cs="Arial"/>
           <w:bCs/>
         </w:rPr>
-        <w:fldChar w:fldCharType="begin"/>
+        <w:t>{m</w:t>
       </w:r>
       <w:r>
         <w:rPr>
           <w:rFonts w:ascii="Arial" w:hAnsi="Arial" w:cs="Arial"/>
           <w:bCs/>
         </w:rPr>
-        <w:instrText>m</w:instrText>
+        <w:t>:for table | db.</w:t>
       </w:r>
       <w:r>
         <w:rPr>
           <w:rFonts w:ascii="Arial" w:hAnsi="Arial" w:cs="Arial"/>
           <w:bCs/>
         </w:rPr>
-        <w:instrText>:for table | db.</w:instrText>
+        <w:t>t</w:t>
       </w:r>
       <w:r>
         <w:rPr>
           <w:rFonts w:ascii="Arial" w:hAnsi="Arial" w:cs="Arial"/>
           <w:bCs/>
         </w:rPr>
-        <w:instrText>t</w:instrText>
+        <w:t>ables</w:t>
       </w:r>
       <w:r>
         <w:rPr>
           <w:rFonts w:ascii="Arial" w:hAnsi="Arial" w:cs="Arial"/>
           <w:bCs/>
         </w:rPr>
-        <w:instrText>ables</w:instrText>
+        <w:t>-&gt;union(db.schemas.tables)</w:t>
       </w:r>
       <w:r>
         <w:rPr>
           <w:rFonts w:ascii="Arial" w:hAnsi="Arial" w:cs="Arial"/>
           <w:bCs/>
         </w:rPr>
-        <w:instrText>-&gt;union(db.schemas.tables)</w:instrText>
-      </w:r>
-      <w:r>
-        <w:rPr>
-          <w:rFonts w:ascii="Arial" w:hAnsi="Arial" w:cs="Arial"/>
-          <w:bCs/>
-        </w:rPr>
-        <w:instrText>-&gt;filter(database::Table)</w:instrText>
-      </w:r>
-      <w:r>
-        <w:rPr>
-          <w:rFonts w:ascii="Arial" w:hAnsi="Arial" w:cs="Arial"/>
-          <w:bCs/>
-        </w:rPr>
-        <w:fldChar w:fldCharType="end"/>
+        <w:t>-&gt;filter(database::Table)}</w:t>
       </w:r>
     </w:p>
     <w:tbl>
@@ -3604,35 +3410,21 @@
                 <w:rFonts w:ascii="Arial" w:hAnsi="Arial" w:cs="Arial"/>
                 <w:bCs/>
               </w:rPr>
-              <w:fldChar w:fldCharType="begin"/>
-            </w:r>
-            <w:r>
-              <w:rPr>
-                <w:rFonts w:ascii="Arial" w:hAnsi="Arial" w:cs="Arial"/>
-                <w:bCs/>
-              </w:rPr>
-              <w:instrText>m:</w:instrText>
-            </w:r>
-            <w:r>
-              <w:rPr>
-                <w:rFonts w:ascii="Arial" w:hAnsi="Arial" w:cs="Arial"/>
-                <w:bCs/>
-              </w:rPr>
-              <w:instrText>table</w:instrText>
-            </w:r>
-            <w:r>
-              <w:rPr>
-                <w:rFonts w:ascii="Arial" w:hAnsi="Arial" w:cs="Arial"/>
-                <w:bCs/>
-              </w:rPr>
-              <w:instrText>.name</w:instrText>
-            </w:r>
-            <w:r>
-              <w:rPr>
-                <w:rFonts w:ascii="Arial" w:hAnsi="Arial" w:cs="Arial"/>
-                <w:bCs/>
-              </w:rPr>
-              <w:fldChar w:fldCharType="end"/>
+              <w:t>{m:</w:t>
+            </w:r>
+            <w:r>
+              <w:rPr>
+                <w:rFonts w:ascii="Arial" w:hAnsi="Arial" w:cs="Arial"/>
+                <w:bCs/>
+              </w:rPr>
+              <w:t>table</w:t>
+            </w:r>
+            <w:r>
+              <w:rPr>
+                <w:rFonts w:ascii="Arial" w:hAnsi="Arial" w:cs="Arial"/>
+                <w:bCs/>
+              </w:rPr>
+              <w:t>.name}</w:t>
             </w:r>
           </w:p>
         </w:tc>
@@ -3656,28 +3448,14 @@
                 <w:rFonts w:ascii="Arial" w:hAnsi="Arial" w:cs="Arial"/>
                 <w:bCs/>
               </w:rPr>
-              <w:fldChar w:fldCharType="begin"/>
-            </w:r>
-            <w:r>
-              <w:rPr>
-                <w:rFonts w:ascii="Arial" w:hAnsi="Arial" w:cs="Arial"/>
-                <w:bCs/>
-              </w:rPr>
-              <w:instrText>m:</w:instrText>
-            </w:r>
-            <w:r>
-              <w:rPr>
-                <w:rFonts w:ascii="Arial" w:hAnsi="Arial" w:cs="Arial"/>
-                <w:bCs/>
-              </w:rPr>
-              <w:instrText>table.comments</w:instrText>
-            </w:r>
-            <w:r>
-              <w:rPr>
-                <w:rFonts w:ascii="Arial" w:hAnsi="Arial" w:cs="Arial"/>
-                <w:bCs/>
-              </w:rPr>
-              <w:fldChar w:fldCharType="end"/>
+              <w:t>{m:</w:t>
+            </w:r>
+            <w:r>
+              <w:rPr>
+                <w:rFonts w:ascii="Arial" w:hAnsi="Arial" w:cs="Arial"/>
+                <w:bCs/>
+              </w:rPr>
+              <w:t>table.comments}</w:t>
             </w:r>
           </w:p>
         </w:tc>
@@ -3699,21 +3477,7 @@
           <w:rFonts w:ascii="Arial" w:hAnsi="Arial" w:cs="Arial"/>
           <w:bCs/>
         </w:rPr>
-        <w:fldChar w:fldCharType="begin"/>
-      </w:r>
-      <w:r>
-        <w:rPr>
-          <w:rFonts w:ascii="Arial" w:hAnsi="Arial" w:cs="Arial"/>
-          <w:bCs/>
-        </w:rPr>
-        <w:instrText xml:space="preserve">m:endfor </w:instrText>
-      </w:r>
-      <w:r>
-        <w:rPr>
-          <w:rFonts w:ascii="Arial" w:hAnsi="Arial" w:cs="Arial"/>
-          <w:bCs/>
-        </w:rPr>
-        <w:fldChar w:fldCharType="end"/>
+        <w:t xml:space="preserve">{m:endfor}</w:t>
       </w:r>
     </w:p>
     <w:p>
@@ -3862,49 +3626,35 @@
           <w:rFonts w:ascii="Arial" w:hAnsi="Arial" w:cs="Arial"/>
           <w:bCs/>
         </w:rPr>
-        <w:fldChar w:fldCharType="begin"/>
+        <w:t>{m</w:t>
       </w:r>
       <w:r>
         <w:rPr>
           <w:rFonts w:ascii="Arial" w:hAnsi="Arial" w:cs="Arial"/>
           <w:bCs/>
         </w:rPr>
-        <w:instrText>m</w:instrText>
+        <w:t xml:space="preserve">:for </w:t>
       </w:r>
       <w:r>
         <w:rPr>
           <w:rFonts w:ascii="Arial" w:hAnsi="Arial" w:cs="Arial"/>
           <w:bCs/>
         </w:rPr>
-        <w:instrText xml:space="preserve">:for </w:instrText>
+        <w:t>seq</w:t>
       </w:r>
       <w:r>
         <w:rPr>
           <w:rFonts w:ascii="Arial" w:hAnsi="Arial" w:cs="Arial"/>
           <w:bCs/>
         </w:rPr>
-        <w:instrText>seq</w:instrText>
+        <w:t xml:space="preserve"> | db.</w:t>
       </w:r>
       <w:r>
         <w:rPr>
           <w:rFonts w:ascii="Arial" w:hAnsi="Arial" w:cs="Arial"/>
           <w:bCs/>
         </w:rPr>
-        <w:instrText xml:space="preserve"> | db.</w:instrText>
-      </w:r>
-      <w:r>
-        <w:rPr>
-          <w:rFonts w:ascii="Arial" w:hAnsi="Arial" w:cs="Arial"/>
-          <w:bCs/>
-        </w:rPr>
-        <w:instrText>sequences-&gt;union(db.schemas.sequences)</w:instrText>
-      </w:r>
-      <w:r>
-        <w:rPr>
-          <w:rFonts w:ascii="Arial" w:hAnsi="Arial" w:cs="Arial"/>
-          <w:bCs/>
-        </w:rPr>
-        <w:fldChar w:fldCharType="end"/>
+        <w:t>sequences-&gt;union(db.schemas.sequences)}</w:t>
       </w:r>
     </w:p>
     <w:tbl>
@@ -3939,35 +3689,21 @@
                 <w:rFonts w:ascii="Arial" w:hAnsi="Arial" w:cs="Arial"/>
                 <w:bCs/>
               </w:rPr>
-              <w:fldChar w:fldCharType="begin"/>
-            </w:r>
-            <w:r>
-              <w:rPr>
-                <w:rFonts w:ascii="Arial" w:hAnsi="Arial" w:cs="Arial"/>
-                <w:bCs/>
-              </w:rPr>
-              <w:instrText>m:</w:instrText>
-            </w:r>
-            <w:r>
-              <w:rPr>
-                <w:rFonts w:ascii="Arial" w:hAnsi="Arial" w:cs="Arial"/>
-                <w:bCs/>
-              </w:rPr>
-              <w:instrText xml:space="preserve"> seq</w:instrText>
-            </w:r>
-            <w:r>
-              <w:rPr>
-                <w:rFonts w:ascii="Arial" w:hAnsi="Arial" w:cs="Arial"/>
-                <w:bCs/>
-              </w:rPr>
-              <w:instrText>.name</w:instrText>
-            </w:r>
-            <w:r>
-              <w:rPr>
-                <w:rFonts w:ascii="Arial" w:hAnsi="Arial" w:cs="Arial"/>
-                <w:bCs/>
-              </w:rPr>
-              <w:fldChar w:fldCharType="end"/>
+              <w:t>{m:</w:t>
+            </w:r>
+            <w:r>
+              <w:rPr>
+                <w:rFonts w:ascii="Arial" w:hAnsi="Arial" w:cs="Arial"/>
+                <w:bCs/>
+              </w:rPr>
+              <w:t xml:space="preserve"> seq</w:t>
+            </w:r>
+            <w:r>
+              <w:rPr>
+                <w:rFonts w:ascii="Arial" w:hAnsi="Arial" w:cs="Arial"/>
+                <w:bCs/>
+              </w:rPr>
+              <w:t>.name}</w:t>
             </w:r>
           </w:p>
         </w:tc>
@@ -3991,28 +3727,14 @@
                 <w:rFonts w:ascii="Arial" w:hAnsi="Arial" w:cs="Arial"/>
                 <w:bCs/>
               </w:rPr>
-              <w:fldChar w:fldCharType="begin"/>
-            </w:r>
-            <w:r>
-              <w:rPr>
-                <w:rFonts w:ascii="Arial" w:hAnsi="Arial" w:cs="Arial"/>
-                <w:bCs/>
-              </w:rPr>
-              <w:instrText>m:</w:instrText>
-            </w:r>
-            <w:r>
-              <w:rPr>
-                <w:rFonts w:ascii="Arial" w:hAnsi="Arial" w:cs="Arial"/>
-                <w:bCs/>
-              </w:rPr>
-              <w:instrText xml:space="preserve"> seq.comments</w:instrText>
-            </w:r>
-            <w:r>
-              <w:rPr>
-                <w:rFonts w:ascii="Arial" w:hAnsi="Arial" w:cs="Arial"/>
-                <w:bCs/>
-              </w:rPr>
-              <w:fldChar w:fldCharType="end"/>
+              <w:t>{m:</w:t>
+            </w:r>
+            <w:r>
+              <w:rPr>
+                <w:rFonts w:ascii="Arial" w:hAnsi="Arial" w:cs="Arial"/>
+                <w:bCs/>
+              </w:rPr>
+              <w:t xml:space="preserve"> seq.comments}</w:t>
             </w:r>
           </w:p>
         </w:tc>
@@ -4034,21 +3756,7 @@
           <w:rFonts w:ascii="Arial" w:hAnsi="Arial" w:cs="Arial"/>
           <w:bCs/>
         </w:rPr>
-        <w:fldChar w:fldCharType="begin"/>
-      </w:r>
-      <w:r>
-        <w:rPr>
-          <w:rFonts w:ascii="Arial" w:hAnsi="Arial" w:cs="Arial"/>
-          <w:bCs/>
-        </w:rPr>
-        <w:instrText xml:space="preserve">m:endfor </w:instrText>
-      </w:r>
-      <w:r>
-        <w:rPr>
-          <w:rFonts w:ascii="Arial" w:hAnsi="Arial" w:cs="Arial"/>
-          <w:bCs/>
-        </w:rPr>
-        <w:fldChar w:fldCharType="end"/>
+        <w:t xml:space="preserve">{m:endfor}</w:t>
       </w:r>
     </w:p>
     <w:p>
@@ -4082,56 +3790,42 @@
           <w:rFonts w:ascii="Arial" w:hAnsi="Arial" w:cs="Arial"/>
           <w:bCs/>
         </w:rPr>
-        <w:fldChar w:fldCharType="begin"/>
+        <w:t>{m</w:t>
       </w:r>
       <w:r>
         <w:rPr>
           <w:rFonts w:ascii="Arial" w:hAnsi="Arial" w:cs="Arial"/>
           <w:bCs/>
         </w:rPr>
-        <w:instrText>m</w:instrText>
+        <w:t xml:space="preserve">:for </w:t>
       </w:r>
       <w:r>
         <w:rPr>
           <w:rFonts w:ascii="Arial" w:hAnsi="Arial" w:cs="Arial"/>
           <w:bCs/>
         </w:rPr>
-        <w:instrText xml:space="preserve">:for </w:instrText>
+        <w:t>seq</w:t>
       </w:r>
       <w:r>
         <w:rPr>
           <w:rFonts w:ascii="Arial" w:hAnsi="Arial" w:cs="Arial"/>
           <w:bCs/>
         </w:rPr>
-        <w:instrText>seq</w:instrText>
+        <w:t xml:space="preserve"> | db.</w:t>
       </w:r>
       <w:r>
         <w:rPr>
           <w:rFonts w:ascii="Arial" w:hAnsi="Arial" w:cs="Arial"/>
           <w:bCs/>
         </w:rPr>
-        <w:instrText xml:space="preserve"> | db.</w:instrText>
+        <w:t>sequences</w:t>
       </w:r>
       <w:r>
         <w:rPr>
           <w:rFonts w:ascii="Arial" w:hAnsi="Arial" w:cs="Arial"/>
           <w:bCs/>
         </w:rPr>
-        <w:instrText>sequences</w:instrText>
-      </w:r>
-      <w:r>
-        <w:rPr>
-          <w:rFonts w:ascii="Arial" w:hAnsi="Arial" w:cs="Arial"/>
-          <w:bCs/>
-        </w:rPr>
-        <w:instrText>-&gt;union(db.schemas.sequences)</w:instrText>
-      </w:r>
-      <w:r>
-        <w:rPr>
-          <w:rFonts w:ascii="Arial" w:hAnsi="Arial" w:cs="Arial"/>
-          <w:bCs/>
-        </w:rPr>
-        <w:fldChar w:fldCharType="end"/>
+        <w:t>-&gt;union(db.schemas.sequences)}</w:t>
       </w:r>
     </w:p>
     <w:p>
@@ -4156,13 +3850,7 @@
       <w:bookmarkEnd w:id="40"/>
       <w:bookmarkEnd w:id="41"/>
       <w:r>
-        <w:fldChar w:fldCharType="begin"/>
-      </w:r>
-      <w:r>
-        <w:instrText>m:seq.name</w:instrText>
-      </w:r>
-      <w:r>
-        <w:fldChar w:fldCharType="end"/>
+        <w:t>{m:seq.name}</w:t>
       </w:r>
     </w:p>
     <w:p>
@@ -4236,28 +3924,14 @@
                 <w:rFonts w:ascii="Arial" w:hAnsi="Arial" w:cs="Arial"/>
                 <w:bCs/>
               </w:rPr>
-              <w:fldChar w:fldCharType="begin"/>
-            </w:r>
-            <w:r>
-              <w:rPr>
-                <w:rFonts w:ascii="Arial" w:hAnsi="Arial" w:cs="Arial"/>
-                <w:bCs/>
-              </w:rPr>
-              <w:instrText>m:</w:instrText>
-            </w:r>
-            <w:r>
-              <w:rPr>
-                <w:rFonts w:ascii="Arial" w:hAnsi="Arial" w:cs="Arial"/>
-                <w:bCs/>
-              </w:rPr>
-              <w:instrText xml:space="preserve"> seq.start</w:instrText>
-            </w:r>
-            <w:r>
-              <w:rPr>
-                <w:rFonts w:ascii="Arial" w:hAnsi="Arial" w:cs="Arial"/>
-                <w:bCs/>
-              </w:rPr>
-              <w:fldChar w:fldCharType="end"/>
+              <w:t>{m:</w:t>
+            </w:r>
+            <w:r>
+              <w:rPr>
+                <w:rFonts w:ascii="Arial" w:hAnsi="Arial" w:cs="Arial"/>
+                <w:bCs/>
+              </w:rPr>
+              <w:t xml:space="preserve"> seq.start}</w:t>
             </w:r>
           </w:p>
         </w:tc>
@@ -4307,28 +3981,14 @@
                 <w:rFonts w:ascii="Arial" w:hAnsi="Arial" w:cs="Arial"/>
                 <w:bCs/>
               </w:rPr>
-              <w:fldChar w:fldCharType="begin"/>
-            </w:r>
-            <w:r>
-              <w:rPr>
-                <w:rFonts w:ascii="Arial" w:hAnsi="Arial" w:cs="Arial"/>
-                <w:bCs/>
-              </w:rPr>
-              <w:instrText>m:</w:instrText>
-            </w:r>
-            <w:r>
-              <w:rPr>
-                <w:rFonts w:ascii="Arial" w:hAnsi="Arial" w:cs="Arial"/>
-                <w:bCs/>
-              </w:rPr>
-              <w:instrText xml:space="preserve"> seq.minValue</w:instrText>
-            </w:r>
-            <w:r>
-              <w:rPr>
-                <w:rFonts w:ascii="Arial" w:hAnsi="Arial" w:cs="Arial"/>
-                <w:bCs/>
-              </w:rPr>
-              <w:fldChar w:fldCharType="end"/>
+              <w:t>{m:</w:t>
+            </w:r>
+            <w:r>
+              <w:rPr>
+                <w:rFonts w:ascii="Arial" w:hAnsi="Arial" w:cs="Arial"/>
+                <w:bCs/>
+              </w:rPr>
+              <w:t xml:space="preserve"> seq.minValue}</w:t>
             </w:r>
           </w:p>
         </w:tc>
@@ -4378,28 +4038,14 @@
                 <w:rFonts w:ascii="Arial" w:hAnsi="Arial" w:cs="Arial"/>
                 <w:bCs/>
               </w:rPr>
-              <w:fldChar w:fldCharType="begin"/>
-            </w:r>
-            <w:r>
-              <w:rPr>
-                <w:rFonts w:ascii="Arial" w:hAnsi="Arial" w:cs="Arial"/>
-                <w:bCs/>
-              </w:rPr>
-              <w:instrText>m:</w:instrText>
-            </w:r>
-            <w:r>
-              <w:rPr>
-                <w:rFonts w:ascii="Arial" w:hAnsi="Arial" w:cs="Arial"/>
-                <w:bCs/>
-              </w:rPr>
-              <w:instrText xml:space="preserve"> seq.maxValue</w:instrText>
-            </w:r>
-            <w:r>
-              <w:rPr>
-                <w:rFonts w:ascii="Arial" w:hAnsi="Arial" w:cs="Arial"/>
-                <w:bCs/>
-              </w:rPr>
-              <w:fldChar w:fldCharType="end"/>
+              <w:t>{m:</w:t>
+            </w:r>
+            <w:r>
+              <w:rPr>
+                <w:rFonts w:ascii="Arial" w:hAnsi="Arial" w:cs="Arial"/>
+                <w:bCs/>
+              </w:rPr>
+              <w:t xml:space="preserve"> seq.maxValue}</w:t>
             </w:r>
           </w:p>
         </w:tc>
@@ -4449,28 +4095,14 @@
                 <w:rFonts w:ascii="Arial" w:hAnsi="Arial" w:cs="Arial"/>
                 <w:bCs/>
               </w:rPr>
-              <w:fldChar w:fldCharType="begin"/>
-            </w:r>
-            <w:r>
-              <w:rPr>
-                <w:rFonts w:ascii="Arial" w:hAnsi="Arial" w:cs="Arial"/>
-                <w:bCs/>
-              </w:rPr>
-              <w:instrText>m:</w:instrText>
-            </w:r>
-            <w:r>
-              <w:rPr>
-                <w:rFonts w:ascii="Arial" w:hAnsi="Arial" w:cs="Arial"/>
-                <w:bCs/>
-              </w:rPr>
-              <w:instrText xml:space="preserve"> seq.cacheSize</w:instrText>
-            </w:r>
-            <w:r>
-              <w:rPr>
-                <w:rFonts w:ascii="Arial" w:hAnsi="Arial" w:cs="Arial"/>
-                <w:bCs/>
-              </w:rPr>
-              <w:fldChar w:fldCharType="end"/>
+              <w:t>{m:</w:t>
+            </w:r>
+            <w:r>
+              <w:rPr>
+                <w:rFonts w:ascii="Arial" w:hAnsi="Arial" w:cs="Arial"/>
+                <w:bCs/>
+              </w:rPr>
+              <w:t xml:space="preserve"> seq.cacheSize}</w:t>
             </w:r>
           </w:p>
         </w:tc>
@@ -4520,28 +4152,14 @@
                 <w:rFonts w:ascii="Arial" w:hAnsi="Arial" w:cs="Arial"/>
                 <w:bCs/>
               </w:rPr>
-              <w:fldChar w:fldCharType="begin"/>
-            </w:r>
-            <w:r>
-              <w:rPr>
-                <w:rFonts w:ascii="Arial" w:hAnsi="Arial" w:cs="Arial"/>
-                <w:bCs/>
-              </w:rPr>
-              <w:instrText>m:</w:instrText>
-            </w:r>
-            <w:r>
-              <w:rPr>
-                <w:rFonts w:ascii="Arial" w:hAnsi="Arial" w:cs="Arial"/>
-                <w:bCs/>
-              </w:rPr>
-              <w:instrText xml:space="preserve"> seq.increment</w:instrText>
-            </w:r>
-            <w:r>
-              <w:rPr>
-                <w:rFonts w:ascii="Arial" w:hAnsi="Arial" w:cs="Arial"/>
-                <w:bCs/>
-              </w:rPr>
-              <w:fldChar w:fldCharType="end"/>
+              <w:t>{m:</w:t>
+            </w:r>
+            <w:r>
+              <w:rPr>
+                <w:rFonts w:ascii="Arial" w:hAnsi="Arial" w:cs="Arial"/>
+                <w:bCs/>
+              </w:rPr>
+              <w:t xml:space="preserve"> seq.increment}</w:t>
             </w:r>
           </w:p>
         </w:tc>
@@ -4591,35 +4209,21 @@
                 <w:rFonts w:ascii="Arial" w:hAnsi="Arial" w:cs="Arial"/>
                 <w:bCs/>
               </w:rPr>
-              <w:fldChar w:fldCharType="begin"/>
-            </w:r>
-            <w:r>
-              <w:rPr>
-                <w:rFonts w:ascii="Arial" w:hAnsi="Arial" w:cs="Arial"/>
-                <w:bCs/>
-              </w:rPr>
-              <w:instrText>m:</w:instrText>
-            </w:r>
-            <w:r>
-              <w:rPr>
-                <w:rFonts w:ascii="Arial" w:hAnsi="Arial" w:cs="Arial"/>
-                <w:bCs/>
-              </w:rPr>
-              <w:instrText xml:space="preserve"> seq.</w:instrText>
-            </w:r>
-            <w:r>
-              <w:rPr>
-                <w:rFonts w:ascii="Arial" w:hAnsi="Arial" w:cs="Arial"/>
-                <w:bCs/>
-              </w:rPr>
-              <w:instrText>isCycle()</w:instrText>
-            </w:r>
-            <w:r>
-              <w:rPr>
-                <w:rFonts w:ascii="Arial" w:hAnsi="Arial" w:cs="Arial"/>
-                <w:bCs/>
-              </w:rPr>
-              <w:fldChar w:fldCharType="end"/>
+              <w:t>{m:</w:t>
+            </w:r>
+            <w:r>
+              <w:rPr>
+                <w:rFonts w:ascii="Arial" w:hAnsi="Arial" w:cs="Arial"/>
+                <w:bCs/>
+              </w:rPr>
+              <w:t xml:space="preserve"> seq.</w:t>
+            </w:r>
+            <w:r>
+              <w:rPr>
+                <w:rFonts w:ascii="Arial" w:hAnsi="Arial" w:cs="Arial"/>
+                <w:bCs/>
+              </w:rPr>
+              <w:t>isCycle()}</w:t>
             </w:r>
           </w:p>
         </w:tc>
@@ -4669,21 +4273,7 @@
                 <w:rFonts w:ascii="Arial" w:hAnsi="Arial" w:cs="Arial"/>
                 <w:bCs/>
               </w:rPr>
-              <w:fldChar w:fldCharType="begin"/>
-            </w:r>
-            <w:r>
-              <w:rPr>
-                <w:rFonts w:ascii="Arial" w:hAnsi="Arial" w:cs="Arial"/>
-                <w:bCs/>
-              </w:rPr>
-              <w:instrText>m: seq.columns.name</w:instrText>
-            </w:r>
-            <w:r>
-              <w:rPr>
-                <w:rFonts w:ascii="Arial" w:hAnsi="Arial" w:cs="Arial"/>
-                <w:bCs/>
-              </w:rPr>
-              <w:fldChar w:fldCharType="end"/>
+              <w:t>{m: seq.columns.name}</w:t>
             </w:r>
           </w:p>
         </w:tc>
@@ -4705,21 +4295,7 @@
           <w:rFonts w:ascii="Arial" w:hAnsi="Arial" w:cs="Arial"/>
           <w:bCs/>
         </w:rPr>
-        <w:fldChar w:fldCharType="begin"/>
-      </w:r>
-      <w:r>
-        <w:rPr>
-          <w:rFonts w:ascii="Arial" w:hAnsi="Arial" w:cs="Arial"/>
-          <w:bCs/>
-        </w:rPr>
-        <w:instrText xml:space="preserve">m:endfor </w:instrText>
-      </w:r>
-      <w:r>
-        <w:rPr>
-          <w:rFonts w:ascii="Arial" w:hAnsi="Arial" w:cs="Arial"/>
-          <w:bCs/>
-        </w:rPr>
-        <w:fldChar w:fldCharType="end"/>
+        <w:t xml:space="preserve">{m:endfor}</w:t>
       </w:r>
     </w:p>
     <w:p>
@@ -4886,50 +4462,35 @@
           <w:rFonts w:ascii="Arial" w:hAnsi="Arial" w:cs="Arial"/>
           <w:bCs/>
         </w:rPr>
-        <w:lastRenderedPageBreak/>
-        <w:fldChar w:fldCharType="begin"/>
+        <w:t>{m</w:t>
       </w:r>
       <w:r>
         <w:rPr>
           <w:rFonts w:ascii="Arial" w:hAnsi="Arial" w:cs="Arial"/>
           <w:bCs/>
         </w:rPr>
-        <w:instrText>m</w:instrText>
+        <w:t xml:space="preserve">:for </w:t>
       </w:r>
       <w:r>
         <w:rPr>
           <w:rFonts w:ascii="Arial" w:hAnsi="Arial" w:cs="Arial"/>
           <w:bCs/>
         </w:rPr>
-        <w:instrText xml:space="preserve">:for </w:instrText>
+        <w:t>view</w:t>
       </w:r>
       <w:r>
         <w:rPr>
           <w:rFonts w:ascii="Arial" w:hAnsi="Arial" w:cs="Arial"/>
           <w:bCs/>
         </w:rPr>
-        <w:instrText>view</w:instrText>
+        <w:t xml:space="preserve"> | db.</w:t>
       </w:r>
       <w:r>
         <w:rPr>
           <w:rFonts w:ascii="Arial" w:hAnsi="Arial" w:cs="Arial"/>
           <w:bCs/>
         </w:rPr>
-        <w:instrText xml:space="preserve"> | db.</w:instrText>
-      </w:r>
-      <w:r>
-        <w:rPr>
-          <w:rFonts w:ascii="Arial" w:hAnsi="Arial" w:cs="Arial"/>
-          <w:bCs/>
-        </w:rPr>
-        <w:instrText>tables-&gt;union(db.schemas.tables)-&gt;filter(database::View)</w:instrText>
-      </w:r>
-      <w:r>
-        <w:rPr>
-          <w:rFonts w:ascii="Arial" w:hAnsi="Arial" w:cs="Arial"/>
-          <w:bCs/>
-        </w:rPr>
-        <w:fldChar w:fldCharType="end"/>
+        <w:t>tables-&gt;union(db.schemas.tables)-&gt;filter(database::View)}</w:t>
       </w:r>
     </w:p>
     <w:tbl>
@@ -4964,35 +4525,21 @@
                 <w:rFonts w:ascii="Arial" w:hAnsi="Arial" w:cs="Arial"/>
                 <w:bCs/>
               </w:rPr>
-              <w:fldChar w:fldCharType="begin"/>
-            </w:r>
-            <w:r>
-              <w:rPr>
-                <w:rFonts w:ascii="Arial" w:hAnsi="Arial" w:cs="Arial"/>
-                <w:bCs/>
-              </w:rPr>
-              <w:instrText>m:</w:instrText>
-            </w:r>
-            <w:r>
-              <w:rPr>
-                <w:rFonts w:ascii="Arial" w:hAnsi="Arial" w:cs="Arial"/>
-                <w:bCs/>
-              </w:rPr>
-              <w:instrText>view</w:instrText>
-            </w:r>
-            <w:r>
-              <w:rPr>
-                <w:rFonts w:ascii="Arial" w:hAnsi="Arial" w:cs="Arial"/>
-                <w:bCs/>
-              </w:rPr>
-              <w:instrText>.name</w:instrText>
-            </w:r>
-            <w:r>
-              <w:rPr>
-                <w:rFonts w:ascii="Arial" w:hAnsi="Arial" w:cs="Arial"/>
-                <w:bCs/>
-              </w:rPr>
-              <w:fldChar w:fldCharType="end"/>
+              <w:t>{m:</w:t>
+            </w:r>
+            <w:r>
+              <w:rPr>
+                <w:rFonts w:ascii="Arial" w:hAnsi="Arial" w:cs="Arial"/>
+                <w:bCs/>
+              </w:rPr>
+              <w:t>view</w:t>
+            </w:r>
+            <w:r>
+              <w:rPr>
+                <w:rFonts w:ascii="Arial" w:hAnsi="Arial" w:cs="Arial"/>
+                <w:bCs/>
+              </w:rPr>
+              <w:t>.name}</w:t>
             </w:r>
           </w:p>
         </w:tc>
@@ -5016,28 +4563,14 @@
                 <w:rFonts w:ascii="Arial" w:hAnsi="Arial" w:cs="Arial"/>
                 <w:bCs/>
               </w:rPr>
-              <w:fldChar w:fldCharType="begin"/>
-            </w:r>
-            <w:r>
-              <w:rPr>
-                <w:rFonts w:ascii="Arial" w:hAnsi="Arial" w:cs="Arial"/>
-                <w:bCs/>
-              </w:rPr>
-              <w:instrText>m:</w:instrText>
-            </w:r>
-            <w:r>
-              <w:rPr>
-                <w:rFonts w:ascii="Arial" w:hAnsi="Arial" w:cs="Arial"/>
-                <w:bCs/>
-              </w:rPr>
-              <w:instrText>view.comments</w:instrText>
-            </w:r>
-            <w:r>
-              <w:rPr>
-                <w:rFonts w:ascii="Arial" w:hAnsi="Arial" w:cs="Arial"/>
-                <w:bCs/>
-              </w:rPr>
-              <w:fldChar w:fldCharType="end"/>
+              <w:t>{m:</w:t>
+            </w:r>
+            <w:r>
+              <w:rPr>
+                <w:rFonts w:ascii="Arial" w:hAnsi="Arial" w:cs="Arial"/>
+                <w:bCs/>
+              </w:rPr>
+              <w:t>view.comments}</w:t>
             </w:r>
           </w:p>
         </w:tc>
@@ -5059,21 +4592,7 @@
           <w:rFonts w:ascii="Arial" w:hAnsi="Arial" w:cs="Arial"/>
           <w:bCs/>
         </w:rPr>
-        <w:fldChar w:fldCharType="begin"/>
-      </w:r>
-      <w:r>
-        <w:rPr>
-          <w:rFonts w:ascii="Arial" w:hAnsi="Arial" w:cs="Arial"/>
-          <w:bCs/>
-        </w:rPr>
-        <w:instrText xml:space="preserve">m:endfor </w:instrText>
-      </w:r>
-      <w:r>
-        <w:rPr>
-          <w:rFonts w:ascii="Arial" w:hAnsi="Arial" w:cs="Arial"/>
-          <w:bCs/>
-        </w:rPr>
-        <w:fldChar w:fldCharType="end"/>
+        <w:t xml:space="preserve">{m:endfor}</w:t>
       </w:r>
     </w:p>
     <w:p>
@@ -5134,42 +4653,28 @@
           <w:rFonts w:ascii="Arial" w:hAnsi="Arial" w:cs="Arial"/>
           <w:bCs/>
         </w:rPr>
-        <w:fldChar w:fldCharType="begin"/>
+        <w:t xml:space="preserve">{m:for </w:t>
       </w:r>
       <w:r>
         <w:rPr>
           <w:rFonts w:ascii="Arial" w:hAnsi="Arial" w:cs="Arial"/>
           <w:bCs/>
         </w:rPr>
-        <w:instrText xml:space="preserve">m:for </w:instrText>
+        <w:t>schema</w:t>
       </w:r>
       <w:r>
         <w:rPr>
           <w:rFonts w:ascii="Arial" w:hAnsi="Arial" w:cs="Arial"/>
           <w:bCs/>
         </w:rPr>
-        <w:instrText>schema</w:instrText>
+        <w:t xml:space="preserve"> | db.</w:t>
       </w:r>
       <w:r>
         <w:rPr>
           <w:rFonts w:ascii="Arial" w:hAnsi="Arial" w:cs="Arial"/>
           <w:bCs/>
         </w:rPr>
-        <w:instrText xml:space="preserve"> | db.</w:instrText>
-      </w:r>
-      <w:r>
-        <w:rPr>
-          <w:rFonts w:ascii="Arial" w:hAnsi="Arial" w:cs="Arial"/>
-          <w:bCs/>
-        </w:rPr>
-        <w:instrText>schemas</w:instrText>
-      </w:r>
-      <w:r>
-        <w:rPr>
-          <w:rFonts w:ascii="Arial" w:hAnsi="Arial" w:cs="Arial"/>
-          <w:bCs/>
-        </w:rPr>
-        <w:fldChar w:fldCharType="end"/>
+        <w:t>schemas}</w:t>
       </w:r>
     </w:p>
     <w:p>
@@ -5194,13 +4699,7 @@
       <w:bookmarkEnd w:id="55"/>
       <w:bookmarkEnd w:id="56"/>
       <w:r>
-        <w:fldChar w:fldCharType="begin"/>
-      </w:r>
-      <w:r>
-        <w:instrText>m:schema.name</w:instrText>
-      </w:r>
-      <w:r>
-        <w:fldChar w:fldCharType="end"/>
+        <w:t>{m:schema.name}</w:t>
       </w:r>
     </w:p>
     <w:p>
@@ -5261,51 +4760,37 @@
                 <w:sz w:val="24"/>
                 <w:szCs w:val="24"/>
               </w:rPr>
-              <w:fldChar w:fldCharType="begin"/>
+              <w:t>{m: schema.asImageByRepresentationDescriptionName('Schema Diagram')</w:t>
             </w:r>
             <w:r>
               <w:rPr>
                 <w:sz w:val="24"/>
                 <w:szCs w:val="24"/>
               </w:rPr>
-              <w:instrText>m: schema.asImageByRepresentationDescriptionName('Schema Diagram')</w:instrText>
+              <w:t>.setConserveRatio(</w:t>
             </w:r>
             <w:r>
               <w:rPr>
                 <w:sz w:val="24"/>
                 <w:szCs w:val="24"/>
               </w:rPr>
-              <w:instrText>.setConserveRatio(</w:instrText>
+              <w:t>true</w:t>
             </w:r>
             <w:r>
               <w:rPr>
                 <w:sz w:val="24"/>
                 <w:szCs w:val="24"/>
               </w:rPr>
-              <w:instrText>true</w:instrText>
-            </w:r>
+              <w:t>)</w:t>
+            </w:r>
+            <w:bookmarkStart w:id="62" w:name="_GoBack"/>
+            <w:bookmarkEnd w:id="62"/>
             <w:r>
               <w:rPr>
                 <w:sz w:val="24"/>
                 <w:szCs w:val="24"/>
               </w:rPr>
-              <w:instrText>)</w:instrText>
-            </w:r>
-            <w:bookmarkStart w:id="62" w:name="_GoBack"/>
-            <w:bookmarkEnd w:id="62"/>
-            <w:r>
-              <w:rPr>
-                <w:sz w:val="24"/>
-                <w:szCs w:val="24"/>
-              </w:rPr>
-              <w:instrText>.setWidth(500)</w:instrText>
-            </w:r>
-            <w:r>
-              <w:rPr>
-                <w:sz w:val="24"/>
-                <w:szCs w:val="24"/>
-              </w:rPr>
-              <w:fldChar w:fldCharType="end"/>
+              <w:t>.setWidth(500)}</w:t>
             </w:r>
             <w:r>
               <w:rPr>
@@ -5361,49 +4846,35 @@
           <w:rFonts w:ascii="Arial" w:hAnsi="Arial" w:cs="Arial"/>
           <w:bCs/>
         </w:rPr>
-        <w:fldChar w:fldCharType="begin"/>
+        <w:t>{m</w:t>
       </w:r>
       <w:r>
         <w:rPr>
           <w:rFonts w:ascii="Arial" w:hAnsi="Arial" w:cs="Arial"/>
           <w:bCs/>
         </w:rPr>
-        <w:instrText>m</w:instrText>
+        <w:t>:for table | schema</w:t>
       </w:r>
       <w:r>
         <w:rPr>
           <w:rFonts w:ascii="Arial" w:hAnsi="Arial" w:cs="Arial"/>
           <w:bCs/>
         </w:rPr>
-        <w:instrText>:for table | schema</w:instrText>
+        <w:t>.</w:t>
       </w:r>
       <w:r>
         <w:rPr>
           <w:rFonts w:ascii="Arial" w:hAnsi="Arial" w:cs="Arial"/>
           <w:bCs/>
         </w:rPr>
-        <w:instrText>.</w:instrText>
+        <w:t>t</w:t>
       </w:r>
       <w:r>
         <w:rPr>
           <w:rFonts w:ascii="Arial" w:hAnsi="Arial" w:cs="Arial"/>
           <w:bCs/>
         </w:rPr>
-        <w:instrText>t</w:instrText>
-      </w:r>
-      <w:r>
-        <w:rPr>
-          <w:rFonts w:ascii="Arial" w:hAnsi="Arial" w:cs="Arial"/>
-          <w:bCs/>
-        </w:rPr>
-        <w:instrText>ables()</w:instrText>
-      </w:r>
-      <w:r>
-        <w:rPr>
-          <w:rFonts w:ascii="Arial" w:hAnsi="Arial" w:cs="Arial"/>
-          <w:bCs/>
-        </w:rPr>
-        <w:fldChar w:fldCharType="end"/>
+        <w:t>ables()}</w:t>
       </w:r>
     </w:p>
     <w:p>
@@ -5433,16 +4904,10 @@
       <w:bookmarkEnd w:id="72"/>
       <w:bookmarkEnd w:id="73"/>
       <w:r>
-        <w:fldChar w:fldCharType="begin"/>
-      </w:r>
-      <w:r>
-        <w:instrText>m</w:instrText>
-      </w:r>
-      <w:r>
-        <w:instrText>:table.name</w:instrText>
-      </w:r>
-      <w:r>
-        <w:fldChar w:fldCharType="end"/>
+        <w:t>{m</w:t>
+      </w:r>
+      <w:r>
+        <w:t>:table.name}</w:t>
       </w:r>
     </w:p>
     <w:p>
@@ -5544,16 +5009,10 @@
               <w:ind w:left="80" w:right="80"/>
             </w:pPr>
             <w:r>
-              <w:fldChar w:fldCharType="begin"/>
-            </w:r>
-            <w:r>
-              <w:instrText>m</w:instrText>
-            </w:r>
-            <w:r>
-              <w:instrText>:table.name</w:instrText>
-            </w:r>
-            <w:r>
-              <w:fldChar w:fldCharType="end"/>
+              <w:t>{m</w:t>
+            </w:r>
+            <w:r>
+              <w:t>:table.name}</w:t>
             </w:r>
           </w:p>
         </w:tc>
@@ -5629,25 +5088,19 @@
         <w:ind w:left="720" w:firstLine="720"/>
       </w:pPr>
       <w:r>
-        <w:fldChar w:fldCharType="begin"/>
-      </w:r>
-      <w:r>
-        <w:instrText xml:space="preserve">m:if not </w:instrText>
-      </w:r>
-      <w:r>
-        <w:instrText>(</w:instrText>
-      </w:r>
-      <w:r>
-        <w:instrText>table.primaryKey</w:instrText>
-      </w:r>
-      <w:r>
-        <w:instrText>=null</w:instrText>
-      </w:r>
-      <w:r>
-        <w:instrText>)</w:instrText>
-      </w:r>
-      <w:r>
-        <w:fldChar w:fldCharType="end"/>
+        <w:t xml:space="preserve">{m:if not </w:t>
+      </w:r>
+      <w:r>
+        <w:t>(</w:t>
+      </w:r>
+      <w:r>
+        <w:t>table.primaryKey</w:t>
+      </w:r>
+      <w:r>
+        <w:t>=null</w:t>
+      </w:r>
+      <w:r>
+        <w:t>)}</w:t>
       </w:r>
     </w:p>
     <w:p>
@@ -5744,16 +5197,10 @@
               </w:rPr>
             </w:pPr>
             <w:r>
-              <w:fldChar w:fldCharType="begin"/>
-            </w:r>
-            <w:r>
-              <w:instrText>m:table.primaryKey</w:instrText>
-            </w:r>
-            <w:r>
-              <w:instrText>.name</w:instrText>
-            </w:r>
-            <w:r>
-              <w:fldChar w:fldCharType="end"/>
+              <w:t>{m:table.primaryKey</w:t>
+            </w:r>
+            <w:r>
+              <w:t>.name}</w:t>
             </w:r>
           </w:p>
         </w:tc>
@@ -5807,16 +5254,10 @@
               <w:ind w:left="80" w:right="80"/>
             </w:pPr>
             <w:r>
-              <w:fldChar w:fldCharType="begin"/>
-            </w:r>
-            <w:r>
-              <w:instrText>m: table.primaryKey</w:instrText>
-            </w:r>
-            <w:r>
-              <w:instrText>.comments</w:instrText>
-            </w:r>
-            <w:r>
-              <w:fldChar w:fldCharType="end"/>
+              <w:t>{m: table.primaryKey</w:t>
+            </w:r>
+            <w:r>
+              <w:t>.comments}</w:t>
             </w:r>
           </w:p>
         </w:tc>
@@ -5870,16 +5311,10 @@
               <w:ind w:left="80" w:right="80"/>
             </w:pPr>
             <w:r>
-              <w:fldChar w:fldCharType="begin"/>
-            </w:r>
-            <w:r>
-              <w:instrText>m:for col | table.primaryKey</w:instrText>
-            </w:r>
-            <w:r>
-              <w:instrText xml:space="preserve">.columns </w:instrText>
-            </w:r>
-            <w:r>
-              <w:fldChar w:fldCharType="end"/>
+              <w:t>{m:for col | table.primaryKey</w:t>
+            </w:r>
+            <w:r>
+              <w:t xml:space="preserve">.columns}</w:t>
             </w:r>
           </w:p>
           <w:p>
@@ -5890,13 +5325,7 @@
               <w:ind w:left="80" w:right="80"/>
             </w:pPr>
             <w:r>
-              <w:fldChar w:fldCharType="begin"/>
-            </w:r>
-            <w:r>
-              <w:instrText>m:col.name</w:instrText>
-            </w:r>
-            <w:r>
-              <w:fldChar w:fldCharType="end"/>
+              <w:t>{m:col.name}</w:t>
             </w:r>
           </w:p>
           <w:p>
@@ -5907,13 +5336,7 @@
               <w:ind w:left="80" w:right="80"/>
             </w:pPr>
             <w:r>
-              <w:fldChar w:fldCharType="begin"/>
-            </w:r>
-            <w:r>
-              <w:instrText xml:space="preserve">m:endfor </w:instrText>
-            </w:r>
-            <w:r>
-              <w:fldChar w:fldCharType="end"/>
+              <w:t xml:space="preserve">{m:endfor}</w:t>
             </w:r>
           </w:p>
         </w:tc>
@@ -5925,13 +5348,7 @@
         <w:ind w:left="720" w:firstLine="720"/>
       </w:pPr>
       <w:r>
-        <w:fldChar w:fldCharType="begin"/>
-      </w:r>
-      <w:r>
-        <w:instrText>m:endif</w:instrText>
-      </w:r>
-      <w:r>
-        <w:fldChar w:fldCharType="end"/>
+        <w:t>{m:endif}</w:t>
       </w:r>
     </w:p>
     <w:p>
@@ -5964,13 +5381,7 @@
         <w:ind w:left="720" w:right="80" w:firstLine="720"/>
       </w:pPr>
       <w:r>
-        <w:fldChar w:fldCharType="begin"/>
-      </w:r>
-      <w:r>
-        <w:instrText>m:for fk | table.foreignKeys</w:instrText>
-      </w:r>
-      <w:r>
-        <w:fldChar w:fldCharType="end"/>
+        <w:t>{m:for fk | table.foreignKeys}</w:t>
       </w:r>
     </w:p>
     <w:tbl>
@@ -6001,13 +5412,7 @@
           </w:tcPr>
           <w:p>
             <w:r>
-              <w:fldChar w:fldCharType="begin"/>
-            </w:r>
-            <w:r>
-              <w:instrText xml:space="preserve"> m:fk.name</w:instrText>
-            </w:r>
-            <w:r>
-              <w:fldChar w:fldCharType="end"/>
+              <w:t>{m:fk.name}</w:t>
             </w:r>
           </w:p>
         </w:tc>
@@ -6029,16 +5434,10 @@
           </w:tcPr>
           <w:p>
             <w:r>
-              <w:fldChar w:fldCharType="begin"/>
-            </w:r>
-            <w:r>
-              <w:instrText xml:space="preserve"> m:fk.</w:instrText>
-            </w:r>
-            <w:r>
-              <w:instrText>owner.name</w:instrText>
-            </w:r>
-            <w:r>
-              <w:fldChar w:fldCharType="end"/>
+              <w:t>{m:fk.</w:t>
+            </w:r>
+            <w:r>
+              <w:t>owner.name}</w:t>
             </w:r>
           </w:p>
         </w:tc>
@@ -6060,85 +5459,49 @@
           </w:tcPr>
           <w:p>
             <w:r>
-              <w:fldChar w:fldCharType="begin"/>
-            </w:r>
-            <w:r>
-              <w:instrText xml:space="preserve"> m:for fke | fk.</w:instrText>
-            </w:r>
-            <w:r>
-              <w:instrText>elements</w:instrText>
-            </w:r>
-            <w:r>
-              <w:fldChar w:fldCharType="end"/>
-            </w:r>
-          </w:p>
-          <w:p>
-            <w:r>
-              <w:fldChar w:fldCharType="begin"/>
-            </w:r>
-            <w:r>
-              <w:instrText xml:space="preserve"> m:fke.</w:instrText>
-            </w:r>
-            <w:r>
-              <w:instrText>primaryKey</w:instrText>
-            </w:r>
-            <w:r>
-              <w:instrText>Column</w:instrText>
-            </w:r>
-            <w:r>
-              <w:instrText>().</w:instrText>
-            </w:r>
-            <w:r>
-              <w:instrText>name</w:instrText>
-            </w:r>
-            <w:r>
-              <w:fldChar w:fldCharType="end"/>
+              <w:t>{m:for fke | fk.</w:t>
+            </w:r>
+            <w:r>
+              <w:t>elements}</w:t>
+            </w:r>
+          </w:p>
+          <w:p>
+            <w:r>
+              <w:t>{m:fke.</w:t>
+            </w:r>
+            <w:r>
+              <w:t>primaryKey</w:t>
+            </w:r>
+            <w:r>
+              <w:t>Column</w:t>
+            </w:r>
+            <w:r>
+              <w:t>().</w:t>
+            </w:r>
+            <w:r>
+              <w:t>name}</w:t>
             </w:r>
             <w:r>
               <w:t xml:space="preserve"> / </w:t>
             </w:r>
             <w:r>
-              <w:fldChar w:fldCharType="begin"/>
-            </w:r>
-            <w:r>
-              <w:instrText xml:space="preserve"> m:fke.pkColumn.name</w:instrText>
-            </w:r>
-            <w:r>
-              <w:fldChar w:fldCharType="end"/>
-            </w:r>
-          </w:p>
-          <w:p>
-            <w:r>
-              <w:fldChar w:fldCharType="begin"/>
-            </w:r>
-            <w:r>
-              <w:instrText xml:space="preserve"> m:fke.foreignKeyColumn().name</w:instrText>
-            </w:r>
-            <w:r>
-              <w:fldChar w:fldCharType="end"/>
+              <w:t>{m:fke.pkColumn.name}</w:t>
+            </w:r>
+          </w:p>
+          <w:p>
+            <w:r>
+              <w:t>{m:fke.foreignKeyColumn().name}</w:t>
             </w:r>
             <w:r>
               <w:t xml:space="preserve"> / </w:t>
             </w:r>
             <w:r>
-              <w:fldChar w:fldCharType="begin"/>
-            </w:r>
-            <w:r>
-              <w:instrText xml:space="preserve"> m:fke.fkColumn.name</w:instrText>
-            </w:r>
-            <w:r>
-              <w:fldChar w:fldCharType="end"/>
-            </w:r>
-          </w:p>
-          <w:p>
-            <w:r>
-              <w:fldChar w:fldCharType="begin"/>
-            </w:r>
-            <w:r>
-              <w:instrText xml:space="preserve"> m:endfor </w:instrText>
-            </w:r>
-            <w:r>
-              <w:fldChar w:fldCharType="end"/>
+              <w:t>{m:fke.fkColumn.name}</w:t>
+            </w:r>
+          </w:p>
+          <w:p>
+            <w:r>
+              <w:t xml:space="preserve">{m:endfor}</w:t>
             </w:r>
           </w:p>
         </w:tc>
@@ -6160,19 +5523,13 @@
           </w:tcPr>
           <w:p>
             <w:r>
-              <w:fldChar w:fldCharType="begin"/>
-            </w:r>
-            <w:r>
-              <w:instrText xml:space="preserve"> m:fk.</w:instrText>
-            </w:r>
-            <w:r>
-              <w:instrText>t</w:instrText>
-            </w:r>
-            <w:r>
-              <w:instrText>arget.name</w:instrText>
-            </w:r>
-            <w:r>
-              <w:fldChar w:fldCharType="end"/>
+              <w:t>{m:fk.</w:t>
+            </w:r>
+            <w:r>
+              <w:t>t</w:t>
+            </w:r>
+            <w:r>
+              <w:t>arget.name}</w:t>
             </w:r>
           </w:p>
         </w:tc>
@@ -6183,13 +5540,7 @@
         <w:ind w:left="720" w:firstLine="720"/>
       </w:pPr>
       <w:r>
-        <w:fldChar w:fldCharType="begin"/>
-      </w:r>
-      <w:r>
-        <w:instrText>m:endfor</w:instrText>
-      </w:r>
-      <w:r>
-        <w:fldChar w:fldCharType="end"/>
+        <w:t>{m:endfor}</w:t>
       </w:r>
     </w:p>
     <w:p>
@@ -6364,49 +5715,35 @@
           <w:rFonts w:ascii="Arial" w:hAnsi="Arial" w:cs="Arial"/>
           <w:bCs/>
         </w:rPr>
-        <w:fldChar w:fldCharType="begin"/>
+        <w:t>{m</w:t>
       </w:r>
       <w:r>
         <w:rPr>
           <w:rFonts w:ascii="Arial" w:hAnsi="Arial" w:cs="Arial"/>
           <w:bCs/>
         </w:rPr>
-        <w:instrText>m</w:instrText>
+        <w:t>:for column | table.</w:t>
       </w:r>
       <w:r>
         <w:rPr>
           <w:rFonts w:ascii="Arial" w:hAnsi="Arial" w:cs="Arial"/>
           <w:bCs/>
         </w:rPr>
-        <w:instrText>:for column | table.</w:instrText>
+        <w:t>allC</w:t>
       </w:r>
       <w:r>
         <w:rPr>
           <w:rFonts w:ascii="Arial" w:hAnsi="Arial" w:cs="Arial"/>
           <w:bCs/>
         </w:rPr>
-        <w:instrText>allC</w:instrText>
+        <w:t>olumns</w:t>
       </w:r>
       <w:r>
         <w:rPr>
           <w:rFonts w:ascii="Arial" w:hAnsi="Arial" w:cs="Arial"/>
           <w:bCs/>
         </w:rPr>
-        <w:instrText>olumns</w:instrText>
-      </w:r>
-      <w:r>
-        <w:rPr>
-          <w:rFonts w:ascii="Arial" w:hAnsi="Arial" w:cs="Arial"/>
-          <w:bCs/>
-        </w:rPr>
-        <w:instrText>()</w:instrText>
-      </w:r>
-      <w:r>
-        <w:rPr>
-          <w:rFonts w:ascii="Arial" w:hAnsi="Arial" w:cs="Arial"/>
-          <w:bCs/>
-        </w:rPr>
-        <w:fldChar w:fldCharType="end"/>
+        <w:t>()}</w:t>
       </w:r>
     </w:p>
     <w:tbl>
@@ -6443,21 +5780,7 @@
                 <w:rFonts w:ascii="Arial" w:hAnsi="Arial" w:cs="Arial"/>
                 <w:bCs/>
               </w:rPr>
-              <w:fldChar w:fldCharType="begin"/>
-            </w:r>
-            <w:r>
-              <w:rPr>
-                <w:rFonts w:ascii="Arial" w:hAnsi="Arial" w:cs="Arial"/>
-                <w:bCs/>
-              </w:rPr>
-              <w:instrText>m:column.name</w:instrText>
-            </w:r>
-            <w:r>
-              <w:rPr>
-                <w:rFonts w:ascii="Arial" w:hAnsi="Arial" w:cs="Arial"/>
-                <w:bCs/>
-              </w:rPr>
-              <w:fldChar w:fldCharType="end"/>
+              <w:t>{m:column.name}</w:t>
             </w:r>
           </w:p>
         </w:tc>
@@ -6481,21 +5804,7 @@
                 <w:rFonts w:ascii="Arial" w:hAnsi="Arial" w:cs="Arial"/>
                 <w:bCs/>
               </w:rPr>
-              <w:fldChar w:fldCharType="begin"/>
-            </w:r>
-            <w:r>
-              <w:rPr>
-                <w:rFonts w:ascii="Arial" w:hAnsi="Arial" w:cs="Arial"/>
-                <w:bCs/>
-              </w:rPr>
-              <w:instrText>m:column.typeName()</w:instrText>
-            </w:r>
-            <w:r>
-              <w:rPr>
-                <w:rFonts w:ascii="Arial" w:hAnsi="Arial" w:cs="Arial"/>
-                <w:bCs/>
-              </w:rPr>
-              <w:fldChar w:fldCharType="end"/>
+              <w:t>{m:column.typeName()}</w:t>
             </w:r>
           </w:p>
         </w:tc>
@@ -6520,35 +5829,21 @@
                 <w:rFonts w:ascii="Arial" w:hAnsi="Arial" w:cs="Arial"/>
                 <w:bCs/>
               </w:rPr>
-              <w:fldChar w:fldCharType="begin"/>
-            </w:r>
-            <w:r>
-              <w:rPr>
-                <w:rFonts w:ascii="Arial" w:hAnsi="Arial" w:cs="Arial"/>
-                <w:bCs/>
-              </w:rPr>
-              <w:instrText>m:column.check</w:instrText>
-            </w:r>
-            <w:r>
-              <w:rPr>
-                <w:rFonts w:ascii="Arial" w:hAnsi="Arial" w:cs="Arial"/>
-                <w:bCs/>
-              </w:rPr>
-              <w:instrText>In</w:instrText>
-            </w:r>
-            <w:r>
-              <w:rPr>
-                <w:rFonts w:ascii="Arial" w:hAnsi="Arial" w:cs="Arial"/>
-                <w:bCs/>
-              </w:rPr>
-              <w:instrText>PrimaryKey()</w:instrText>
-            </w:r>
-            <w:r>
-              <w:rPr>
-                <w:rFonts w:ascii="Arial" w:hAnsi="Arial" w:cs="Arial"/>
-                <w:bCs/>
-              </w:rPr>
-              <w:fldChar w:fldCharType="end"/>
+              <w:t>{m:column.check</w:t>
+            </w:r>
+            <w:r>
+              <w:rPr>
+                <w:rFonts w:ascii="Arial" w:hAnsi="Arial" w:cs="Arial"/>
+                <w:bCs/>
+              </w:rPr>
+              <w:t>In</w:t>
+            </w:r>
+            <w:r>
+              <w:rPr>
+                <w:rFonts w:ascii="Arial" w:hAnsi="Arial" w:cs="Arial"/>
+                <w:bCs/>
+              </w:rPr>
+              <w:t>PrimaryKey()}</w:t>
             </w:r>
           </w:p>
         </w:tc>
@@ -6573,35 +5868,21 @@
                 <w:rFonts w:ascii="Arial" w:hAnsi="Arial" w:cs="Arial"/>
                 <w:bCs/>
               </w:rPr>
-              <w:fldChar w:fldCharType="begin"/>
-            </w:r>
-            <w:r>
-              <w:rPr>
-                <w:rFonts w:ascii="Arial" w:hAnsi="Arial" w:cs="Arial"/>
-                <w:bCs/>
-              </w:rPr>
-              <w:instrText>m:column.check</w:instrText>
-            </w:r>
-            <w:r>
-              <w:rPr>
-                <w:rFonts w:ascii="Arial" w:hAnsi="Arial" w:cs="Arial"/>
-                <w:bCs/>
-              </w:rPr>
-              <w:instrText>In</w:instrText>
-            </w:r>
-            <w:r>
-              <w:rPr>
-                <w:rFonts w:ascii="Arial" w:hAnsi="Arial" w:cs="Arial"/>
-                <w:bCs/>
-              </w:rPr>
-              <w:instrText>ForeignKey()</w:instrText>
-            </w:r>
-            <w:r>
-              <w:rPr>
-                <w:rFonts w:ascii="Arial" w:hAnsi="Arial" w:cs="Arial"/>
-                <w:bCs/>
-              </w:rPr>
-              <w:fldChar w:fldCharType="end"/>
+              <w:t>{m:column.check</w:t>
+            </w:r>
+            <w:r>
+              <w:rPr>
+                <w:rFonts w:ascii="Arial" w:hAnsi="Arial" w:cs="Arial"/>
+                <w:bCs/>
+              </w:rPr>
+              <w:t>In</w:t>
+            </w:r>
+            <w:r>
+              <w:rPr>
+                <w:rFonts w:ascii="Arial" w:hAnsi="Arial" w:cs="Arial"/>
+                <w:bCs/>
+              </w:rPr>
+              <w:t>ForeignKey()}</w:t>
             </w:r>
           </w:p>
         </w:tc>
@@ -6623,28 +5904,14 @@
           <w:rFonts w:ascii="Arial" w:hAnsi="Arial" w:cs="Arial"/>
           <w:bCs/>
         </w:rPr>
-        <w:fldChar w:fldCharType="begin"/>
+        <w:t>{m</w:t>
       </w:r>
       <w:r>
         <w:rPr>
           <w:rFonts w:ascii="Arial" w:hAnsi="Arial" w:cs="Arial"/>
           <w:bCs/>
         </w:rPr>
-        <w:instrText>m</w:instrText>
-      </w:r>
-      <w:r>
-        <w:rPr>
-          <w:rFonts w:ascii="Arial" w:hAnsi="Arial" w:cs="Arial"/>
-          <w:bCs/>
-        </w:rPr>
-        <w:instrText>:endfor</w:instrText>
-      </w:r>
-      <w:r>
-        <w:rPr>
-          <w:rFonts w:ascii="Arial" w:hAnsi="Arial" w:cs="Arial"/>
-          <w:bCs/>
-        </w:rPr>
-        <w:fldChar w:fldCharType="end"/>
+        <w:t>:endfor}</w:t>
       </w:r>
     </w:p>
     <w:p>
@@ -6707,28 +5974,14 @@
           <w:rFonts w:ascii="Arial" w:hAnsi="Arial" w:cs="Arial"/>
           <w:bCs/>
         </w:rPr>
-        <w:fldChar w:fldCharType="begin"/>
+        <w:t xml:space="preserve">{m:for </w:t>
       </w:r>
       <w:r>
         <w:rPr>
           <w:rFonts w:ascii="Arial" w:hAnsi="Arial" w:cs="Arial"/>
           <w:bCs/>
         </w:rPr>
-        <w:instrText xml:space="preserve">m:for </w:instrText>
-      </w:r>
-      <w:r>
-        <w:rPr>
-          <w:rFonts w:ascii="Arial" w:hAnsi="Arial" w:cs="Arial"/>
-          <w:bCs/>
-        </w:rPr>
-        <w:instrText>index | table.indexes</w:instrText>
-      </w:r>
-      <w:r>
-        <w:rPr>
-          <w:rFonts w:ascii="Arial" w:hAnsi="Arial" w:cs="Arial"/>
-          <w:bCs/>
-        </w:rPr>
-        <w:fldChar w:fldCharType="end"/>
+        <w:t>index | table.indexes}</w:t>
       </w:r>
     </w:p>
     <w:tbl>
@@ -6787,35 +6040,21 @@
                 <w:rFonts w:ascii="Arial" w:hAnsi="Arial" w:cs="Arial"/>
                 <w:bCs/>
               </w:rPr>
-              <w:fldChar w:fldCharType="begin"/>
-            </w:r>
-            <w:r>
-              <w:rPr>
-                <w:rFonts w:ascii="Arial" w:hAnsi="Arial" w:cs="Arial"/>
-                <w:bCs/>
-              </w:rPr>
-              <w:instrText>m:</w:instrText>
-            </w:r>
-            <w:r>
-              <w:rPr>
-                <w:rFonts w:ascii="Arial" w:hAnsi="Arial" w:cs="Arial"/>
-                <w:bCs/>
-              </w:rPr>
-              <w:instrText>index</w:instrText>
-            </w:r>
-            <w:r>
-              <w:rPr>
-                <w:rFonts w:ascii="Arial" w:hAnsi="Arial" w:cs="Arial"/>
-                <w:bCs/>
-              </w:rPr>
-              <w:instrText>.name</w:instrText>
-            </w:r>
-            <w:r>
-              <w:rPr>
-                <w:rFonts w:ascii="Arial" w:hAnsi="Arial" w:cs="Arial"/>
-                <w:bCs/>
-              </w:rPr>
-              <w:fldChar w:fldCharType="end"/>
+              <w:t>{m:</w:t>
+            </w:r>
+            <w:r>
+              <w:rPr>
+                <w:rFonts w:ascii="Arial" w:hAnsi="Arial" w:cs="Arial"/>
+                <w:bCs/>
+              </w:rPr>
+              <w:t>index</w:t>
+            </w:r>
+            <w:r>
+              <w:rPr>
+                <w:rFonts w:ascii="Arial" w:hAnsi="Arial" w:cs="Arial"/>
+                <w:bCs/>
+              </w:rPr>
+              <w:t>.name}</w:t>
             </w:r>
           </w:p>
         </w:tc>
@@ -6865,28 +6104,14 @@
                 <w:rFonts w:ascii="Arial" w:hAnsi="Arial" w:cs="Arial"/>
                 <w:bCs/>
               </w:rPr>
-              <w:fldChar w:fldCharType="begin"/>
-            </w:r>
-            <w:r>
-              <w:rPr>
-                <w:rFonts w:ascii="Arial" w:hAnsi="Arial" w:cs="Arial"/>
-                <w:bCs/>
-              </w:rPr>
-              <w:instrText>m:</w:instrText>
-            </w:r>
-            <w:r>
-              <w:rPr>
-                <w:rFonts w:ascii="Arial" w:hAnsi="Arial" w:cs="Arial"/>
-                <w:bCs/>
-              </w:rPr>
-              <w:instrText>index.ID</w:instrText>
-            </w:r>
-            <w:r>
-              <w:rPr>
-                <w:rFonts w:ascii="Arial" w:hAnsi="Arial" w:cs="Arial"/>
-                <w:bCs/>
-              </w:rPr>
-              <w:fldChar w:fldCharType="end"/>
+              <w:t>{m:</w:t>
+            </w:r>
+            <w:r>
+              <w:rPr>
+                <w:rFonts w:ascii="Arial" w:hAnsi="Arial" w:cs="Arial"/>
+                <w:bCs/>
+              </w:rPr>
+              <w:t>index.ID}</w:t>
             </w:r>
           </w:p>
         </w:tc>
@@ -6938,28 +6163,14 @@
                 <w:rFonts w:ascii="Arial" w:hAnsi="Arial" w:cs="Arial"/>
                 <w:bCs/>
               </w:rPr>
-              <w:fldChar w:fldCharType="begin"/>
-            </w:r>
-            <w:r>
-              <w:rPr>
-                <w:rFonts w:ascii="Arial" w:hAnsi="Arial" w:cs="Arial"/>
-                <w:bCs/>
-              </w:rPr>
-              <w:instrText>m:</w:instrText>
-            </w:r>
-            <w:r>
-              <w:rPr>
-                <w:rFonts w:ascii="Arial" w:hAnsi="Arial" w:cs="Arial"/>
-                <w:bCs/>
-              </w:rPr>
-              <w:instrText>index.techID</w:instrText>
-            </w:r>
-            <w:r>
-              <w:rPr>
-                <w:rFonts w:ascii="Arial" w:hAnsi="Arial" w:cs="Arial"/>
-                <w:bCs/>
-              </w:rPr>
-              <w:fldChar w:fldCharType="end"/>
+              <w:t>{m:</w:t>
+            </w:r>
+            <w:r>
+              <w:rPr>
+                <w:rFonts w:ascii="Arial" w:hAnsi="Arial" w:cs="Arial"/>
+                <w:bCs/>
+              </w:rPr>
+              <w:t>index.techID}</w:t>
             </w:r>
           </w:p>
         </w:tc>
@@ -7009,21 +6220,7 @@
                 <w:rFonts w:ascii="Arial" w:hAnsi="Arial" w:cs="Arial"/>
                 <w:bCs/>
               </w:rPr>
-              <w:fldChar w:fldCharType="begin"/>
-            </w:r>
-            <w:r>
-              <w:rPr>
-                <w:rFonts w:ascii="Arial" w:hAnsi="Arial" w:cs="Arial"/>
-                <w:bCs/>
-              </w:rPr>
-              <w:instrText>m:index.comments</w:instrText>
-            </w:r>
-            <w:r>
-              <w:rPr>
-                <w:rFonts w:ascii="Arial" w:hAnsi="Arial" w:cs="Arial"/>
-                <w:bCs/>
-              </w:rPr>
-              <w:fldChar w:fldCharType="end"/>
+              <w:t>{m:index.comments}</w:t>
             </w:r>
           </w:p>
         </w:tc>
@@ -7074,21 +6271,7 @@
                 <w:rFonts w:ascii="Arial" w:hAnsi="Arial" w:cs="Arial"/>
                 <w:bCs/>
               </w:rPr>
-              <w:fldChar w:fldCharType="begin"/>
-            </w:r>
-            <w:r>
-              <w:rPr>
-                <w:rFonts w:ascii="Arial" w:hAnsi="Arial" w:cs="Arial"/>
-                <w:bCs/>
-              </w:rPr>
-              <w:instrText>m:index.cardinality</w:instrText>
-            </w:r>
-            <w:r>
-              <w:rPr>
-                <w:rFonts w:ascii="Arial" w:hAnsi="Arial" w:cs="Arial"/>
-                <w:bCs/>
-              </w:rPr>
-              <w:fldChar w:fldCharType="end"/>
+              <w:t>{m:index.cardinality}</w:t>
             </w:r>
           </w:p>
         </w:tc>
@@ -7138,21 +6321,7 @@
                 <w:rFonts w:ascii="Arial" w:hAnsi="Arial" w:cs="Arial"/>
                 <w:bCs/>
               </w:rPr>
-              <w:fldChar w:fldCharType="begin"/>
-            </w:r>
-            <w:r>
-              <w:rPr>
-                <w:rFonts w:ascii="Arial" w:hAnsi="Arial" w:cs="Arial"/>
-                <w:bCs/>
-              </w:rPr>
-              <w:instrText>m:index.indexType</w:instrText>
-            </w:r>
-            <w:r>
-              <w:rPr>
-                <w:rFonts w:ascii="Arial" w:hAnsi="Arial" w:cs="Arial"/>
-                <w:bCs/>
-              </w:rPr>
-              <w:fldChar w:fldCharType="end"/>
+              <w:t>{m:index.indexType}</w:t>
             </w:r>
           </w:p>
         </w:tc>
@@ -7204,21 +6373,7 @@
                 <w:rFonts w:ascii="Arial" w:hAnsi="Arial" w:cs="Arial"/>
                 <w:bCs/>
               </w:rPr>
-              <w:fldChar w:fldCharType="begin"/>
-            </w:r>
-            <w:r>
-              <w:rPr>
-                <w:rFonts w:ascii="Arial" w:hAnsi="Arial" w:cs="Arial"/>
-                <w:bCs/>
-              </w:rPr>
-              <w:instrText>m:index.owner.name</w:instrText>
-            </w:r>
-            <w:r>
-              <w:rPr>
-                <w:rFonts w:ascii="Arial" w:hAnsi="Arial" w:cs="Arial"/>
-                <w:bCs/>
-              </w:rPr>
-              <w:fldChar w:fldCharType="end"/>
+              <w:t>{m:index.owner.name}</w:t>
             </w:r>
           </w:p>
         </w:tc>
@@ -7268,21 +6423,7 @@
                 <w:rFonts w:ascii="Arial" w:hAnsi="Arial" w:cs="Arial"/>
                 <w:bCs/>
               </w:rPr>
-              <w:fldChar w:fldCharType="begin"/>
-            </w:r>
-            <w:r>
-              <w:rPr>
-                <w:rFonts w:ascii="Arial" w:hAnsi="Arial" w:cs="Arial"/>
-                <w:bCs/>
-              </w:rPr>
-              <w:instrText>m:index.qualifier</w:instrText>
-            </w:r>
-            <w:r>
-              <w:rPr>
-                <w:rFonts w:ascii="Arial" w:hAnsi="Arial" w:cs="Arial"/>
-                <w:bCs/>
-              </w:rPr>
-              <w:fldChar w:fldCharType="end"/>
+              <w:t>{m:index.qualifier}</w:t>
             </w:r>
           </w:p>
         </w:tc>
@@ -7332,21 +6473,7 @@
                 <w:rFonts w:ascii="Arial" w:hAnsi="Arial" w:cs="Arial"/>
                 <w:bCs/>
               </w:rPr>
-              <w:fldChar w:fldCharType="begin"/>
-            </w:r>
-            <w:r>
-              <w:rPr>
-                <w:rFonts w:ascii="Arial" w:hAnsi="Arial" w:cs="Arial"/>
-                <w:bCs/>
-              </w:rPr>
-              <w:instrText>m:index.unique</w:instrText>
-            </w:r>
-            <w:r>
-              <w:rPr>
-                <w:rFonts w:ascii="Arial" w:hAnsi="Arial" w:cs="Arial"/>
-                <w:bCs/>
-              </w:rPr>
-              <w:fldChar w:fldCharType="end"/>
+              <w:t>{m:index.unique}</w:t>
             </w:r>
             <w:r>
               <w:rPr>
@@ -7360,21 +6487,7 @@
                 <w:rFonts w:ascii="Arial" w:hAnsi="Arial" w:cs="Arial"/>
                 <w:bCs/>
               </w:rPr>
-              <w:fldChar w:fldCharType="begin"/>
-            </w:r>
-            <w:r>
-              <w:rPr>
-                <w:rFonts w:ascii="Arial" w:hAnsi="Arial" w:cs="Arial"/>
-                <w:bCs/>
-              </w:rPr>
-              <w:instrText>m:index.isUnic()</w:instrText>
-            </w:r>
-            <w:r>
-              <w:rPr>
-                <w:rFonts w:ascii="Arial" w:hAnsi="Arial" w:cs="Arial"/>
-                <w:bCs/>
-              </w:rPr>
-              <w:fldChar w:fldCharType="end"/>
+              <w:t>{m:index.isUnic()}</w:t>
             </w:r>
             <w:r>
               <w:rPr>
@@ -7388,28 +6501,14 @@
                 <w:rFonts w:ascii="Arial" w:hAnsi="Arial" w:cs="Arial"/>
                 <w:bCs/>
               </w:rPr>
-              <w:fldChar w:fldCharType="begin"/>
-            </w:r>
-            <w:r>
-              <w:rPr>
-                <w:rFonts w:ascii="Arial" w:hAnsi="Arial" w:cs="Arial"/>
-                <w:bCs/>
-              </w:rPr>
-              <w:instrText>m:index.check</w:instrText>
-            </w:r>
-            <w:r>
-              <w:rPr>
-                <w:rFonts w:ascii="Arial" w:hAnsi="Arial" w:cs="Arial"/>
-                <w:bCs/>
-              </w:rPr>
-              <w:instrText>Unique()</w:instrText>
-            </w:r>
-            <w:r>
-              <w:rPr>
-                <w:rFonts w:ascii="Arial" w:hAnsi="Arial" w:cs="Arial"/>
-                <w:bCs/>
-              </w:rPr>
-              <w:fldChar w:fldCharType="end"/>
+              <w:t>{m:index.check</w:t>
+            </w:r>
+            <w:r>
+              <w:rPr>
+                <w:rFonts w:ascii="Arial" w:hAnsi="Arial" w:cs="Arial"/>
+                <w:bCs/>
+              </w:rPr>
+              <w:t>Unique()}</w:t>
             </w:r>
           </w:p>
         </w:tc>
@@ -7459,28 +6558,14 @@
                 <w:rFonts w:ascii="Arial" w:hAnsi="Arial" w:cs="Arial"/>
                 <w:bCs/>
               </w:rPr>
-              <w:fldChar w:fldCharType="begin"/>
-            </w:r>
-            <w:r>
-              <w:rPr>
-                <w:rFonts w:ascii="Arial" w:hAnsi="Arial" w:cs="Arial"/>
-                <w:bCs/>
-              </w:rPr>
-              <w:instrText xml:space="preserve">m:for </w:instrText>
-            </w:r>
-            <w:r>
-              <w:rPr>
-                <w:rFonts w:ascii="Arial" w:hAnsi="Arial" w:cs="Arial"/>
-                <w:bCs/>
-              </w:rPr>
-              <w:instrText>indexElement | index.elements</w:instrText>
-            </w:r>
-            <w:r>
-              <w:rPr>
-                <w:rFonts w:ascii="Arial" w:hAnsi="Arial" w:cs="Arial"/>
-                <w:bCs/>
-              </w:rPr>
-              <w:fldChar w:fldCharType="end"/>
+              <w:t xml:space="preserve">{m:for </w:t>
+            </w:r>
+            <w:r>
+              <w:rPr>
+                <w:rFonts w:ascii="Arial" w:hAnsi="Arial" w:cs="Arial"/>
+                <w:bCs/>
+              </w:rPr>
+              <w:t>indexElement | index.elements}</w:t>
             </w:r>
           </w:p>
           <w:p>
@@ -7499,21 +6584,7 @@
                 <w:rFonts w:ascii="Arial" w:hAnsi="Arial" w:cs="Arial"/>
                 <w:bCs/>
               </w:rPr>
-              <w:fldChar w:fldCharType="begin"/>
-            </w:r>
-            <w:r>
-              <w:rPr>
-                <w:rFonts w:ascii="Arial" w:hAnsi="Arial" w:cs="Arial"/>
-                <w:bCs/>
-              </w:rPr>
-              <w:instrText>m:indexElement.column.name</w:instrText>
-            </w:r>
-            <w:r>
-              <w:rPr>
-                <w:rFonts w:ascii="Arial" w:hAnsi="Arial" w:cs="Arial"/>
-                <w:bCs/>
-              </w:rPr>
-              <w:fldChar w:fldCharType="end"/>
+              <w:t>{m:indexElement.column.name}</w:t>
             </w:r>
             <w:r>
               <w:rPr>
@@ -7527,49 +6598,35 @@
                 <w:rFonts w:ascii="Arial" w:hAnsi="Arial" w:cs="Arial"/>
                 <w:bCs/>
               </w:rPr>
-              <w:fldChar w:fldCharType="begin"/>
-            </w:r>
-            <w:r>
-              <w:rPr>
-                <w:rFonts w:ascii="Arial" w:hAnsi="Arial" w:cs="Arial"/>
-                <w:bCs/>
-              </w:rPr>
-              <w:instrText>m:indexElement.</w:instrText>
-            </w:r>
-            <w:r>
-              <w:rPr>
-                <w:rFonts w:ascii="Arial" w:hAnsi="Arial" w:cs="Arial"/>
-                <w:bCs/>
-              </w:rPr>
-              <w:instrText>isA</w:instrText>
-            </w:r>
-            <w:r>
-              <w:rPr>
-                <w:rFonts w:ascii="Arial" w:hAnsi="Arial" w:cs="Arial"/>
-                <w:bCs/>
-              </w:rPr>
-              <w:instrText>scend</w:instrText>
-            </w:r>
-            <w:r>
-              <w:rPr>
-                <w:rFonts w:ascii="Arial" w:hAnsi="Arial" w:cs="Arial"/>
-                <w:bCs/>
-              </w:rPr>
-              <w:instrText>ing</w:instrText>
-            </w:r>
-            <w:r>
-              <w:rPr>
-                <w:rFonts w:ascii="Arial" w:hAnsi="Arial" w:cs="Arial"/>
-                <w:bCs/>
-              </w:rPr>
-              <w:instrText>()</w:instrText>
-            </w:r>
-            <w:r>
-              <w:rPr>
-                <w:rFonts w:ascii="Arial" w:hAnsi="Arial" w:cs="Arial"/>
-                <w:bCs/>
-              </w:rPr>
-              <w:fldChar w:fldCharType="end"/>
+              <w:t>{m:indexElement.</w:t>
+            </w:r>
+            <w:r>
+              <w:rPr>
+                <w:rFonts w:ascii="Arial" w:hAnsi="Arial" w:cs="Arial"/>
+                <w:bCs/>
+              </w:rPr>
+              <w:t>isA</w:t>
+            </w:r>
+            <w:r>
+              <w:rPr>
+                <w:rFonts w:ascii="Arial" w:hAnsi="Arial" w:cs="Arial"/>
+                <w:bCs/>
+              </w:rPr>
+              <w:t>scend</w:t>
+            </w:r>
+            <w:r>
+              <w:rPr>
+                <w:rFonts w:ascii="Arial" w:hAnsi="Arial" w:cs="Arial"/>
+                <w:bCs/>
+              </w:rPr>
+              <w:t>ing</w:t>
+            </w:r>
+            <w:r>
+              <w:rPr>
+                <w:rFonts w:ascii="Arial" w:hAnsi="Arial" w:cs="Arial"/>
+                <w:bCs/>
+              </w:rPr>
+              <w:t>()}</w:t>
             </w:r>
           </w:p>
           <w:p>
@@ -7588,21 +6645,7 @@
                 <w:rFonts w:ascii="Arial" w:hAnsi="Arial" w:cs="Arial"/>
                 <w:bCs/>
               </w:rPr>
-              <w:fldChar w:fldCharType="begin"/>
-            </w:r>
-            <w:r>
-              <w:rPr>
-                <w:rFonts w:ascii="Arial" w:hAnsi="Arial" w:cs="Arial"/>
-                <w:bCs/>
-              </w:rPr>
-              <w:instrText>m:endfor</w:instrText>
-            </w:r>
-            <w:r>
-              <w:rPr>
-                <w:rFonts w:ascii="Arial" w:hAnsi="Arial" w:cs="Arial"/>
-                <w:bCs/>
-              </w:rPr>
-              <w:fldChar w:fldCharType="end"/>
+              <w:t>{m:endfor}</w:t>
             </w:r>
           </w:p>
         </w:tc>
@@ -7624,21 +6667,7 @@
           <w:rFonts w:ascii="Arial" w:hAnsi="Arial" w:cs="Arial"/>
           <w:bCs/>
         </w:rPr>
-        <w:fldChar w:fldCharType="begin"/>
-      </w:r>
-      <w:r>
-        <w:rPr>
-          <w:rFonts w:ascii="Arial" w:hAnsi="Arial" w:cs="Arial"/>
-          <w:bCs/>
-        </w:rPr>
-        <w:instrText>m:endfor</w:instrText>
-      </w:r>
-      <w:r>
-        <w:rPr>
-          <w:rFonts w:ascii="Arial" w:hAnsi="Arial" w:cs="Arial"/>
-          <w:bCs/>
-        </w:rPr>
-        <w:fldChar w:fldCharType="end"/>
+        <w:t>{m:endfor}</w:t>
       </w:r>
     </w:p>
     <w:p>
@@ -7705,28 +6734,14 @@
           <w:rFonts w:ascii="Arial" w:hAnsi="Arial" w:cs="Arial"/>
           <w:bCs/>
         </w:rPr>
-        <w:fldChar w:fldCharType="begin"/>
+        <w:t xml:space="preserve">{m:for </w:t>
       </w:r>
       <w:r>
         <w:rPr>
           <w:rFonts w:ascii="Arial" w:hAnsi="Arial" w:cs="Arial"/>
           <w:bCs/>
         </w:rPr>
-        <w:instrText xml:space="preserve">m:for </w:instrText>
-      </w:r>
-      <w:r>
-        <w:rPr>
-          <w:rFonts w:ascii="Arial" w:hAnsi="Arial" w:cs="Arial"/>
-          <w:bCs/>
-        </w:rPr>
-        <w:instrText>constraint | table.constraints</w:instrText>
-      </w:r>
-      <w:r>
-        <w:rPr>
-          <w:rFonts w:ascii="Arial" w:hAnsi="Arial" w:cs="Arial"/>
-          <w:bCs/>
-        </w:rPr>
-        <w:fldChar w:fldCharType="end"/>
+        <w:t>constraint | table.constraints}</w:t>
       </w:r>
     </w:p>
     <w:tbl>
@@ -7836,28 +6851,14 @@
                 <w:rFonts w:ascii="Arial" w:hAnsi="Arial" w:cs="Arial"/>
                 <w:bCs/>
               </w:rPr>
-              <w:fldChar w:fldCharType="begin"/>
-            </w:r>
-            <w:r>
-              <w:rPr>
-                <w:rFonts w:ascii="Arial" w:hAnsi="Arial" w:cs="Arial"/>
-                <w:bCs/>
-              </w:rPr>
-              <w:instrText xml:space="preserve">m: </w:instrText>
-            </w:r>
-            <w:r>
-              <w:rPr>
-                <w:rFonts w:ascii="Arial" w:hAnsi="Arial" w:cs="Arial"/>
-                <w:bCs/>
-              </w:rPr>
-              <w:instrText>constraint.name</w:instrText>
-            </w:r>
-            <w:r>
-              <w:rPr>
-                <w:rFonts w:ascii="Arial" w:hAnsi="Arial" w:cs="Arial"/>
-                <w:bCs/>
-              </w:rPr>
-              <w:fldChar w:fldCharType="end"/>
+              <w:t xml:space="preserve">{m: </w:t>
+            </w:r>
+            <w:r>
+              <w:rPr>
+                <w:rFonts w:ascii="Arial" w:hAnsi="Arial" w:cs="Arial"/>
+                <w:bCs/>
+              </w:rPr>
+              <w:t>constraint.name}</w:t>
             </w:r>
           </w:p>
         </w:tc>
@@ -7881,21 +6882,7 @@
                 <w:rFonts w:ascii="Arial" w:hAnsi="Arial" w:cs="Arial"/>
                 <w:bCs/>
               </w:rPr>
-              <w:fldChar w:fldCharType="begin"/>
-            </w:r>
-            <w:r>
-              <w:rPr>
-                <w:rFonts w:ascii="Arial" w:hAnsi="Arial" w:cs="Arial"/>
-                <w:bCs/>
-              </w:rPr>
-              <w:instrText>m: constraint.expression</w:instrText>
-            </w:r>
-            <w:r>
-              <w:rPr>
-                <w:rFonts w:ascii="Arial" w:hAnsi="Arial" w:cs="Arial"/>
-                <w:bCs/>
-              </w:rPr>
-              <w:fldChar w:fldCharType="end"/>
+              <w:t>{m: constraint.expression}</w:t>
             </w:r>
           </w:p>
         </w:tc>
@@ -7919,21 +6906,7 @@
                 <w:rFonts w:ascii="Arial" w:hAnsi="Arial" w:cs="Arial"/>
                 <w:bCs/>
               </w:rPr>
-              <w:fldChar w:fldCharType="begin"/>
-            </w:r>
-            <w:r>
-              <w:rPr>
-                <w:rFonts w:ascii="Arial" w:hAnsi="Arial" w:cs="Arial"/>
-                <w:bCs/>
-              </w:rPr>
-              <w:instrText>m:constraint.comments</w:instrText>
-            </w:r>
-            <w:r>
-              <w:rPr>
-                <w:rFonts w:ascii="Arial" w:hAnsi="Arial" w:cs="Arial"/>
-                <w:bCs/>
-              </w:rPr>
-              <w:fldChar w:fldCharType="end"/>
+              <w:t>{m:constraint.comments}</w:t>
             </w:r>
           </w:p>
         </w:tc>
@@ -7967,21 +6940,7 @@
                 <w:rFonts w:ascii="Arial" w:hAnsi="Arial" w:cs="Arial"/>
                 <w:bCs/>
               </w:rPr>
-              <w:fldChar w:fldCharType="begin"/>
-            </w:r>
-            <w:r>
-              <w:rPr>
-                <w:rFonts w:ascii="Arial" w:hAnsi="Arial" w:cs="Arial"/>
-                <w:bCs/>
-              </w:rPr>
-              <w:instrText>m: constraint.ID</w:instrText>
-            </w:r>
-            <w:r>
-              <w:rPr>
-                <w:rFonts w:ascii="Arial" w:hAnsi="Arial" w:cs="Arial"/>
-                <w:bCs/>
-              </w:rPr>
-              <w:fldChar w:fldCharType="end"/>
+              <w:t>{m: constraint.ID}</w:t>
             </w:r>
             <w:r>
               <w:rPr>
@@ -8011,21 +6970,7 @@
                 <w:rFonts w:ascii="Arial" w:hAnsi="Arial" w:cs="Arial"/>
                 <w:bCs/>
               </w:rPr>
-              <w:fldChar w:fldCharType="begin"/>
-            </w:r>
-            <w:r>
-              <w:rPr>
-                <w:rFonts w:ascii="Arial" w:hAnsi="Arial" w:cs="Arial"/>
-                <w:bCs/>
-              </w:rPr>
-              <w:instrText>m: constraint.techID</w:instrText>
-            </w:r>
-            <w:r>
-              <w:rPr>
-                <w:rFonts w:ascii="Arial" w:hAnsi="Arial" w:cs="Arial"/>
-                <w:bCs/>
-              </w:rPr>
-              <w:fldChar w:fldCharType="end"/>
+              <w:t>{m: constraint.techID}</w:t>
             </w:r>
           </w:p>
         </w:tc>
@@ -8047,21 +6992,7 @@
           <w:rFonts w:ascii="Arial" w:hAnsi="Arial" w:cs="Arial"/>
           <w:bCs/>
         </w:rPr>
-        <w:fldChar w:fldCharType="begin"/>
-      </w:r>
-      <w:r>
-        <w:rPr>
-          <w:rFonts w:ascii="Arial" w:hAnsi="Arial" w:cs="Arial"/>
-          <w:bCs/>
-        </w:rPr>
-        <w:instrText xml:space="preserve">m:endfor </w:instrText>
-      </w:r>
-      <w:r>
-        <w:rPr>
-          <w:rFonts w:ascii="Arial" w:hAnsi="Arial" w:cs="Arial"/>
-          <w:bCs/>
-        </w:rPr>
-        <w:fldChar w:fldCharType="end"/>
+        <w:t xml:space="preserve">{m:endfor}</w:t>
       </w:r>
     </w:p>
     <w:p>
@@ -8114,19 +7045,13 @@
         <w:ind w:left="720" w:right="80" w:firstLine="720"/>
       </w:pPr>
       <w:r>
-        <w:fldChar w:fldCharType="begin"/>
-      </w:r>
-      <w:r>
-        <w:instrText>m:for column |table.</w:instrText>
-      </w:r>
-      <w:r>
-        <w:instrText>c</w:instrText>
-      </w:r>
-      <w:r>
-        <w:instrText>olumns</w:instrText>
-      </w:r>
-      <w:r>
-        <w:fldChar w:fldCharType="end"/>
+        <w:t>{m:for column |table.</w:t>
+      </w:r>
+      <w:r>
+        <w:t>c</w:t>
+      </w:r>
+      <w:r>
+        <w:t>olumns}</w:t>
       </w:r>
     </w:p>
     <w:p>
@@ -8156,16 +7081,10 @@
       <w:bookmarkEnd w:id="116"/>
       <w:bookmarkEnd w:id="117"/>
       <w:r>
-        <w:fldChar w:fldCharType="begin"/>
-      </w:r>
-      <w:r>
-        <w:instrText>m</w:instrText>
-      </w:r>
-      <w:r>
-        <w:instrText>:column.name</w:instrText>
-      </w:r>
-      <w:r>
-        <w:fldChar w:fldCharType="end"/>
+        <w:t>{m</w:t>
+      </w:r>
+      <w:r>
+        <w:t>:column.name}</w:t>
       </w:r>
     </w:p>
     <w:p>
@@ -8240,19 +7159,13 @@
               <w:ind w:left="80" w:right="80"/>
             </w:pPr>
             <w:r>
-              <w:fldChar w:fldCharType="begin"/>
-            </w:r>
-            <w:r>
-              <w:instrText>m</w:instrText>
-            </w:r>
-            <w:r>
-              <w:instrText>:</w:instrText>
-            </w:r>
-            <w:r>
-              <w:instrText>column.name</w:instrText>
-            </w:r>
-            <w:r>
-              <w:fldChar w:fldCharType="end"/>
+              <w:t>{m</w:t>
+            </w:r>
+            <w:r>
+              <w:t>:</w:t>
+            </w:r>
+            <w:r>
+              <w:t>column.name}</w:t>
             </w:r>
             <w:r>
               <w:tab/>
@@ -8309,13 +7222,7 @@
               <w:ind w:left="80" w:right="80"/>
             </w:pPr>
             <w:r>
-              <w:fldChar w:fldCharType="begin"/>
-            </w:r>
-            <w:r>
-              <w:instrText>m:column.ID</w:instrText>
-            </w:r>
-            <w:r>
-              <w:fldChar w:fldCharType="end"/>
+              <w:t>{m:column.ID}</w:t>
             </w:r>
           </w:p>
         </w:tc>
@@ -8371,13 +7278,7 @@
               <w:ind w:left="80" w:right="80"/>
             </w:pPr>
             <w:r>
-              <w:fldChar w:fldCharType="begin"/>
-            </w:r>
-            <w:r>
-              <w:instrText>m:column.techID</w:instrText>
-            </w:r>
-            <w:r>
-              <w:fldChar w:fldCharType="end"/>
+              <w:t>{m:column.techID}</w:t>
             </w:r>
           </w:p>
         </w:tc>
@@ -8431,19 +7332,13 @@
               <w:ind w:left="80" w:right="80"/>
             </w:pPr>
             <w:r>
-              <w:fldChar w:fldCharType="begin"/>
-            </w:r>
-            <w:r>
-              <w:instrText>m</w:instrText>
-            </w:r>
-            <w:r>
-              <w:instrText>:column.type</w:instrText>
-            </w:r>
-            <w:r>
-              <w:instrText>Name()</w:instrText>
-            </w:r>
-            <w:r>
-              <w:fldChar w:fldCharType="end"/>
+              <w:t>{m</w:t>
+            </w:r>
+            <w:r>
+              <w:t>:column.type</w:t>
+            </w:r>
+            <w:r>
+              <w:t>Name()}</w:t>
             </w:r>
           </w:p>
         </w:tc>
@@ -8497,13 +7392,7 @@
               <w:ind w:left="80" w:right="80"/>
             </w:pPr>
             <w:r>
-              <w:fldChar w:fldCharType="begin"/>
-            </w:r>
-            <w:r>
-              <w:instrText>m:column.type</w:instrText>
-            </w:r>
-            <w:r>
-              <w:fldChar w:fldCharType="end"/>
+              <w:t>{m:column.type}</w:t>
             </w:r>
           </w:p>
         </w:tc>
@@ -8557,16 +7446,10 @@
               <w:ind w:left="80" w:right="80"/>
             </w:pPr>
             <w:r>
-              <w:fldChar w:fldCharType="begin"/>
-            </w:r>
-            <w:r>
-              <w:instrText>m:column.t</w:instrText>
-            </w:r>
-            <w:r>
-              <w:instrText>ypeLength()</w:instrText>
-            </w:r>
-            <w:r>
-              <w:fldChar w:fldCharType="end"/>
+              <w:t>{m:column.t</w:t>
+            </w:r>
+            <w:r>
+              <w:t>ypeLength()}</w:t>
             </w:r>
           </w:p>
         </w:tc>
@@ -8620,37 +7503,25 @@
               <w:ind w:left="80" w:right="80"/>
             </w:pPr>
             <w:r>
-              <w:fldChar w:fldCharType="begin"/>
-            </w:r>
-            <w:r>
-              <w:instrText>m</w:instrText>
-            </w:r>
-            <w:r>
-              <w:instrText>:</w:instrText>
-            </w:r>
-            <w:r>
-              <w:instrText>column.</w:instrText>
-            </w:r>
-            <w:r>
-              <w:instrText>isMandatory</w:instrText>
-            </w:r>
-            <w:r>
-              <w:instrText>()</w:instrText>
-            </w:r>
-            <w:r>
-              <w:fldChar w:fldCharType="end"/>
+              <w:t>{m</w:t>
+            </w:r>
+            <w:r>
+              <w:t>:</w:t>
+            </w:r>
+            <w:r>
+              <w:t>column.</w:t>
+            </w:r>
+            <w:r>
+              <w:t>isMandatory</w:t>
+            </w:r>
+            <w:r>
+              <w:t>()}</w:t>
             </w:r>
             <w:r>
               <w:t xml:space="preserve"> / </w:t>
             </w:r>
             <w:r>
-              <w:fldChar w:fldCharType="begin"/>
-            </w:r>
-            <w:r>
-              <w:instrText>m:column.checkMandatory()</w:instrText>
-            </w:r>
-            <w:r>
-              <w:fldChar w:fldCharType="end"/>
+              <w:t>{m:column.checkMandatory()}</w:t>
             </w:r>
           </w:p>
         </w:tc>
@@ -8704,16 +7575,10 @@
               <w:ind w:left="80" w:right="80"/>
             </w:pPr>
             <w:r>
-              <w:fldChar w:fldCharType="begin"/>
-            </w:r>
-            <w:r>
-              <w:instrText>m</w:instrText>
-            </w:r>
-            <w:r>
-              <w:instrText>:column.comments</w:instrText>
-            </w:r>
-            <w:r>
-              <w:fldChar w:fldCharType="end"/>
+              <w:t>{m</w:t>
+            </w:r>
+            <w:r>
+              <w:t>:column.comments}</w:t>
             </w:r>
           </w:p>
         </w:tc>
@@ -8767,43 +7632,31 @@
               <w:ind w:left="80" w:right="80"/>
             </w:pPr>
             <w:r>
-              <w:fldChar w:fldCharType="begin"/>
-            </w:r>
-            <w:r>
-              <w:instrText>m</w:instrText>
-            </w:r>
-            <w:r>
-              <w:instrText>:</w:instrText>
-            </w:r>
-            <w:r>
-              <w:instrText>column.</w:instrText>
-            </w:r>
-            <w:r>
-              <w:instrText>is</w:instrText>
-            </w:r>
-            <w:r>
-              <w:instrText>In</w:instrText>
-            </w:r>
-            <w:r>
-              <w:instrText>PrimaryKey</w:instrText>
-            </w:r>
-            <w:r>
-              <w:instrText>()</w:instrText>
-            </w:r>
-            <w:r>
-              <w:fldChar w:fldCharType="end"/>
+              <w:t>{m</w:t>
+            </w:r>
+            <w:r>
+              <w:t>:</w:t>
+            </w:r>
+            <w:r>
+              <w:t>column.</w:t>
+            </w:r>
+            <w:r>
+              <w:t>is</w:t>
+            </w:r>
+            <w:r>
+              <w:t>In</w:t>
+            </w:r>
+            <w:r>
+              <w:t>PrimaryKey</w:t>
+            </w:r>
+            <w:r>
+              <w:t>()}</w:t>
             </w:r>
             <w:r>
               <w:t xml:space="preserve"> / </w:t>
             </w:r>
             <w:r>
-              <w:fldChar w:fldCharType="begin"/>
-            </w:r>
-            <w:r>
-              <w:instrText>m:column.checkInPrimaryKey()</w:instrText>
-            </w:r>
-            <w:r>
-              <w:fldChar w:fldCharType="end"/>
+              <w:t>{m:column.checkInPrimaryKey()}</w:t>
             </w:r>
           </w:p>
         </w:tc>
@@ -8857,43 +7710,31 @@
               <w:ind w:left="80" w:right="80"/>
             </w:pPr>
             <w:r>
-              <w:fldChar w:fldCharType="begin"/>
-            </w:r>
-            <w:r>
-              <w:instrText>m</w:instrText>
-            </w:r>
-            <w:r>
-              <w:instrText>:</w:instrText>
-            </w:r>
-            <w:r>
-              <w:instrText>column.</w:instrText>
-            </w:r>
-            <w:r>
-              <w:instrText>is</w:instrText>
-            </w:r>
-            <w:r>
-              <w:instrText>In</w:instrText>
-            </w:r>
-            <w:r>
-              <w:instrText>ForeignKey</w:instrText>
-            </w:r>
-            <w:r>
-              <w:instrText>()</w:instrText>
-            </w:r>
-            <w:r>
-              <w:fldChar w:fldCharType="end"/>
+              <w:t>{m</w:t>
+            </w:r>
+            <w:r>
+              <w:t>:</w:t>
+            </w:r>
+            <w:r>
+              <w:t>column.</w:t>
+            </w:r>
+            <w:r>
+              <w:t>is</w:t>
+            </w:r>
+            <w:r>
+              <w:t>In</w:t>
+            </w:r>
+            <w:r>
+              <w:t>ForeignKey</w:t>
+            </w:r>
+            <w:r>
+              <w:t>()}</w:t>
             </w:r>
             <w:r>
               <w:t xml:space="preserve"> / </w:t>
             </w:r>
             <w:r>
-              <w:fldChar w:fldCharType="begin"/>
-            </w:r>
-            <w:r>
-              <w:instrText>m:column.checkInForeignKey()</w:instrText>
-            </w:r>
-            <w:r>
-              <w:fldChar w:fldCharType="end"/>
+              <w:t>{m:column.checkInForeignKey()}</w:t>
             </w:r>
           </w:p>
         </w:tc>
@@ -8947,13 +7788,7 @@
               <w:ind w:left="80" w:right="80"/>
             </w:pPr>
             <w:r>
-              <w:fldChar w:fldCharType="begin"/>
-            </w:r>
-            <w:r>
-              <w:instrText>m:column.defaultValue</w:instrText>
-            </w:r>
-            <w:r>
-              <w:fldChar w:fldCharType="end"/>
+              <w:t>{m:column.defaultValue}</w:t>
             </w:r>
           </w:p>
         </w:tc>
@@ -9007,25 +7842,13 @@
               <w:ind w:left="80" w:right="80"/>
             </w:pPr>
             <w:r>
-              <w:fldChar w:fldCharType="begin"/>
-            </w:r>
-            <w:r>
-              <w:instrText>m:column.autoincrement</w:instrText>
-            </w:r>
-            <w:r>
-              <w:fldChar w:fldCharType="end"/>
+              <w:t>{m:column.autoincrement}</w:t>
             </w:r>
             <w:r>
               <w:t xml:space="preserve"> / </w:t>
             </w:r>
             <w:r>
-              <w:fldChar w:fldCharType="begin"/>
-            </w:r>
-            <w:r>
-              <w:instrText>m:column.isAutoincrement()</w:instrText>
-            </w:r>
-            <w:r>
-              <w:fldChar w:fldCharType="end"/>
+              <w:t>{m:column.isAutoincrement()}</w:t>
             </w:r>
           </w:p>
         </w:tc>
@@ -9079,25 +7902,13 @@
               <w:ind w:left="80" w:right="80"/>
             </w:pPr>
             <w:r>
-              <w:fldChar w:fldCharType="begin"/>
-            </w:r>
-            <w:r>
-              <w:instrText>m:column.inForeignKey</w:instrText>
-            </w:r>
-            <w:r>
-              <w:fldChar w:fldCharType="end"/>
+              <w:t>{m:column.inForeignKey}</w:t>
             </w:r>
             <w:r>
               <w:t xml:space="preserve"> / </w:t>
             </w:r>
             <w:r>
-              <w:fldChar w:fldCharType="begin"/>
-            </w:r>
-            <w:r>
-              <w:instrText>m:column.isInForeignKey()</w:instrText>
-            </w:r>
-            <w:r>
-              <w:fldChar w:fldCharType="end"/>
+              <w:t>{m:column.isInForeignKey()}</w:t>
             </w:r>
           </w:p>
         </w:tc>
@@ -9151,25 +7962,13 @@
               <w:ind w:left="80" w:right="80"/>
             </w:pPr>
             <w:r>
-              <w:fldChar w:fldCharType="begin"/>
-            </w:r>
-            <w:r>
-              <w:instrText>m:column.inPrimaryKey</w:instrText>
-            </w:r>
-            <w:r>
-              <w:fldChar w:fldCharType="end"/>
+              <w:t>{m:column.inPrimaryKey}</w:t>
             </w:r>
             <w:r>
               <w:t xml:space="preserve"> / </w:t>
             </w:r>
             <w:r>
-              <w:fldChar w:fldCharType="begin"/>
-            </w:r>
-            <w:r>
-              <w:instrText>m:column.isInPrimaryKey()</w:instrText>
-            </w:r>
-            <w:r>
-              <w:fldChar w:fldCharType="end"/>
+              <w:t>{m:column.isInPrimaryKey()}</w:t>
             </w:r>
           </w:p>
         </w:tc>
@@ -9232,37 +8031,19 @@
               <w:ind w:left="80" w:right="80"/>
             </w:pPr>
             <w:r>
-              <w:fldChar w:fldCharType="begin"/>
-            </w:r>
-            <w:r>
-              <w:instrText>m:column.nullable</w:instrText>
-            </w:r>
-            <w:r>
-              <w:fldChar w:fldCharType="end"/>
+              <w:t>{m:column.nullable}</w:t>
             </w:r>
             <w:r>
               <w:t xml:space="preserve"> / </w:t>
             </w:r>
             <w:r>
-              <w:fldChar w:fldCharType="begin"/>
-            </w:r>
-            <w:r>
-              <w:instrText>m:column.isNullable()</w:instrText>
-            </w:r>
-            <w:r>
-              <w:fldChar w:fldCharType="end"/>
+              <w:t>{m:column.isNullable()}</w:t>
             </w:r>
             <w:r>
               <w:t xml:space="preserve"> / </w:t>
             </w:r>
             <w:r>
-              <w:fldChar w:fldCharType="begin"/>
-            </w:r>
-            <w:r>
-              <w:instrText>m:column.checkNullable()</w:instrText>
-            </w:r>
-            <w:r>
-              <w:fldChar w:fldCharType="end"/>
+              <w:t>{m:column.checkNullable()}</w:t>
             </w:r>
           </w:p>
         </w:tc>
@@ -9316,55 +8097,37 @@
               <w:ind w:left="80" w:right="80"/>
             </w:pPr>
             <w:r>
-              <w:fldChar w:fldCharType="begin"/>
-            </w:r>
-            <w:r>
-              <w:instrText>m:column.</w:instrText>
-            </w:r>
-            <w:r>
-              <w:instrText>unique</w:instrText>
-            </w:r>
-            <w:r>
-              <w:fldChar w:fldCharType="end"/>
+              <w:t>{m:column.</w:t>
+            </w:r>
+            <w:r>
+              <w:t>unique}</w:t>
             </w:r>
             <w:r>
               <w:t xml:space="preserve"> / </w:t>
             </w:r>
             <w:r>
-              <w:fldChar w:fldCharType="begin"/>
-            </w:r>
-            <w:r>
-              <w:instrText>m:column.</w:instrText>
-            </w:r>
-            <w:r>
-              <w:instrText>is</w:instrText>
-            </w:r>
-            <w:r>
-              <w:instrText>Uni</w:instrText>
-            </w:r>
-            <w:r>
-              <w:instrText>c</w:instrText>
-            </w:r>
-            <w:r>
-              <w:instrText>()</w:instrText>
-            </w:r>
-            <w:r>
-              <w:fldChar w:fldCharType="end"/>
+              <w:t>{m:column.</w:t>
+            </w:r>
+            <w:r>
+              <w:t>is</w:t>
+            </w:r>
+            <w:r>
+              <w:t>Uni</w:t>
+            </w:r>
+            <w:r>
+              <w:t>c</w:t>
+            </w:r>
+            <w:r>
+              <w:t>()}</w:t>
             </w:r>
             <w:r>
               <w:t xml:space="preserve"> / </w:t>
             </w:r>
             <w:r>
-              <w:fldChar w:fldCharType="begin"/>
-            </w:r>
-            <w:r>
-              <w:instrText>m:column.</w:instrText>
-            </w:r>
-            <w:r>
-              <w:instrText>checkUnique()</w:instrText>
-            </w:r>
-            <w:r>
-              <w:fldChar w:fldCharType="end"/>
+              <w:t>{m:column.</w:t>
+            </w:r>
+            <w:r>
+              <w:t>checkUnique()}</w:t>
             </w:r>
           </w:p>
         </w:tc>
@@ -9420,13 +8183,7 @@
               <w:ind w:left="80" w:right="80"/>
             </w:pPr>
             <w:r>
-              <w:fldChar w:fldCharType="begin"/>
-            </w:r>
-            <w:r>
-              <w:instrText>m:column.owner.name</w:instrText>
-            </w:r>
-            <w:r>
-              <w:fldChar w:fldCharType="end"/>
+              <w:t>{m:column.owner.name}</w:t>
             </w:r>
           </w:p>
         </w:tc>
@@ -9478,19 +8235,13 @@
               <w:adjustRightInd w:val="0"/>
             </w:pPr>
             <w:r>
-              <w:fldChar w:fldCharType="begin"/>
-            </w:r>
-            <w:r>
-              <w:instrText>m:if not (</w:instrText>
-            </w:r>
-            <w:r>
-              <w:instrText>column.index</w:instrText>
-            </w:r>
-            <w:r>
-              <w:instrText>es =null)</w:instrText>
-            </w:r>
-            <w:r>
-              <w:fldChar w:fldCharType="end"/>
+              <w:t>{m:if not (</w:t>
+            </w:r>
+            <w:r>
+              <w:t>column.index</w:t>
+            </w:r>
+            <w:r>
+              <w:t>es =null)}</w:t>
             </w:r>
           </w:p>
           <w:p>
@@ -9501,73 +8252,49 @@
               <w:ind w:right="80"/>
             </w:pPr>
             <w:r>
-              <w:fldChar w:fldCharType="begin"/>
-            </w:r>
-            <w:r>
-              <w:instrText>m:for idx |</w:instrText>
-            </w:r>
-            <w:r>
-              <w:instrText xml:space="preserve"> column.index</w:instrText>
-            </w:r>
-            <w:r>
-              <w:instrText xml:space="preserve">es </w:instrText>
-            </w:r>
-            <w:r>
-              <w:fldChar w:fldCharType="end"/>
-            </w:r>
-          </w:p>
-          <w:p>
-            <w:pPr>
-              <w:widowControl w:val="0"/>
-              <w:adjustRightInd w:val="0"/>
-            </w:pPr>
-            <w:r>
-              <w:fldChar w:fldCharType="begin"/>
-            </w:r>
-            <w:r>
-              <w:instrText>m:</w:instrText>
-            </w:r>
-            <w:r>
-              <w:instrText>id</w:instrText>
-            </w:r>
-            <w:r>
-              <w:instrText>x</w:instrText>
-            </w:r>
-            <w:r>
-              <w:instrText>.name</w:instrText>
-            </w:r>
-            <w:r>
-              <w:fldChar w:fldCharType="end"/>
-            </w:r>
-          </w:p>
-          <w:p>
-            <w:pPr>
-              <w:widowControl w:val="0"/>
-              <w:adjustRightInd w:val="0"/>
-            </w:pPr>
-            <w:r>
-              <w:fldChar w:fldCharType="begin"/>
-            </w:r>
-            <w:r>
-              <w:instrText>m:endfor</w:instrText>
-            </w:r>
-            <w:r>
-              <w:fldChar w:fldCharType="end"/>
-            </w:r>
-          </w:p>
-          <w:p>
-            <w:pPr>
-              <w:widowControl w:val="0"/>
-              <w:adjustRightInd w:val="0"/>
-            </w:pPr>
-            <w:r>
-              <w:fldChar w:fldCharType="begin"/>
-            </w:r>
-            <w:r>
-              <w:instrText>m:endif</w:instrText>
-            </w:r>
-            <w:r>
-              <w:fldChar w:fldCharType="end"/>
+              <w:t>{m:for idx |</w:t>
+            </w:r>
+            <w:r>
+              <w:t xml:space="preserve"> column.index</w:t>
+            </w:r>
+            <w:r>
+              <w:t xml:space="preserve">es}</w:t>
+            </w:r>
+          </w:p>
+          <w:p>
+            <w:pPr>
+              <w:widowControl w:val="0"/>
+              <w:adjustRightInd w:val="0"/>
+            </w:pPr>
+            <w:r>
+              <w:t>{m:</w:t>
+            </w:r>
+            <w:r>
+              <w:t>id</w:t>
+            </w:r>
+            <w:r>
+              <w:t>x</w:t>
+            </w:r>
+            <w:r>
+              <w:t>.name}</w:t>
+            </w:r>
+          </w:p>
+          <w:p>
+            <w:pPr>
+              <w:widowControl w:val="0"/>
+              <w:adjustRightInd w:val="0"/>
+            </w:pPr>
+            <w:r>
+              <w:t>{m:endfor}</w:t>
+            </w:r>
+          </w:p>
+          <w:p>
+            <w:pPr>
+              <w:widowControl w:val="0"/>
+              <w:adjustRightInd w:val="0"/>
+            </w:pPr>
+            <w:r>
+              <w:t>{m:endif}</w:t>
             </w:r>
           </w:p>
           <w:p>
@@ -9598,16 +8325,10 @@
         <w:ind w:left="720" w:firstLine="720"/>
       </w:pPr>
       <w:r>
-        <w:fldChar w:fldCharType="begin"/>
-      </w:r>
-      <w:r>
-        <w:instrText>m</w:instrText>
-      </w:r>
-      <w:r>
-        <w:instrText>:endfor</w:instrText>
-      </w:r>
-      <w:r>
-        <w:fldChar w:fldCharType="end"/>
+        <w:t>{m</w:t>
+      </w:r>
+      <w:r>
+        <w:t>:endfor}</w:t>
       </w:r>
     </w:p>
     <w:p>
@@ -9617,13 +8338,7 @@
         <w:ind w:firstLine="720"/>
       </w:pPr>
       <w:r>
-        <w:fldChar w:fldCharType="begin"/>
-      </w:r>
-      <w:r>
-        <w:instrText>m:endfor</w:instrText>
-      </w:r>
-      <w:r>
-        <w:fldChar w:fldCharType="end"/>
+        <w:t>{m:endfor}</w:t>
       </w:r>
     </w:p>
     <w:p>
@@ -9666,16 +8381,10 @@
         <w:ind w:left="720" w:right="80"/>
       </w:pPr>
       <w:r>
-        <w:fldChar w:fldCharType="begin"/>
-      </w:r>
-      <w:r>
-        <w:instrText>m:for view | schema.views</w:instrText>
-      </w:r>
-      <w:r>
-        <w:instrText>()</w:instrText>
-      </w:r>
-      <w:r>
-        <w:fldChar w:fldCharType="end"/>
+        <w:t>{m:for view | schema.views</w:t>
+      </w:r>
+      <w:r>
+        <w:t>()}</w:t>
       </w:r>
     </w:p>
     <w:p>
@@ -9701,13 +8410,7 @@
       <w:bookmarkEnd w:id="126"/>
       <w:bookmarkEnd w:id="127"/>
       <w:r>
-        <w:fldChar w:fldCharType="begin"/>
-      </w:r>
-      <w:r>
-        <w:instrText>m:view.name</w:instrText>
-      </w:r>
-      <w:r>
-        <w:fldChar w:fldCharType="end"/>
+        <w:t>{m:view.name}</w:t>
       </w:r>
     </w:p>
     <w:tbl>
@@ -9738,16 +8441,10 @@
           </w:tcPr>
           <w:p>
             <w:r>
-              <w:fldChar w:fldCharType="begin"/>
-            </w:r>
-            <w:r>
-              <w:instrText>m:view</w:instrText>
-            </w:r>
-            <w:r>
-              <w:instrText>.query</w:instrText>
-            </w:r>
-            <w:r>
-              <w:fldChar w:fldCharType="end"/>
+              <w:t>{m:view</w:t>
+            </w:r>
+            <w:r>
+              <w:t>.query}</w:t>
             </w:r>
           </w:p>
         </w:tc>
@@ -9769,13 +8466,7 @@
           </w:tcPr>
           <w:p>
             <w:r>
-              <w:fldChar w:fldCharType="begin"/>
-            </w:r>
-            <w:r>
-              <w:instrText>m:view.comments</w:instrText>
-            </w:r>
-            <w:r>
-              <w:fldChar w:fldCharType="end"/>
+              <w:t>{m:view.comments}</w:t>
             </w:r>
           </w:p>
         </w:tc>
@@ -9854,13 +8545,7 @@
         <w:ind w:firstLine="720"/>
       </w:pPr>
       <w:r>
-        <w:fldChar w:fldCharType="begin"/>
-      </w:r>
-      <w:r>
-        <w:instrText>m:endfor</w:instrText>
-      </w:r>
-      <w:r>
-        <w:fldChar w:fldCharType="end"/>
+        <w:t>{m:endfor}</w:t>
       </w:r>
     </w:p>
     <w:p>
@@ -9911,49 +8596,35 @@
           <w:rFonts w:ascii="Arial" w:hAnsi="Arial" w:cs="Arial"/>
           <w:bCs/>
         </w:rPr>
-        <w:fldChar w:fldCharType="begin"/>
+        <w:t>{m</w:t>
       </w:r>
       <w:r>
         <w:rPr>
           <w:rFonts w:ascii="Arial" w:hAnsi="Arial" w:cs="Arial"/>
           <w:bCs/>
         </w:rPr>
-        <w:instrText>m</w:instrText>
+        <w:t xml:space="preserve">:for </w:t>
       </w:r>
       <w:r>
         <w:rPr>
           <w:rFonts w:ascii="Arial" w:hAnsi="Arial" w:cs="Arial"/>
           <w:bCs/>
         </w:rPr>
-        <w:instrText xml:space="preserve">:for </w:instrText>
+        <w:t>seq | schema</w:t>
       </w:r>
       <w:r>
         <w:rPr>
           <w:rFonts w:ascii="Arial" w:hAnsi="Arial" w:cs="Arial"/>
           <w:bCs/>
         </w:rPr>
-        <w:instrText>seq | schema</w:instrText>
+        <w:t>.</w:t>
       </w:r>
       <w:r>
         <w:rPr>
           <w:rFonts w:ascii="Arial" w:hAnsi="Arial" w:cs="Arial"/>
           <w:bCs/>
         </w:rPr>
-        <w:instrText>.</w:instrText>
-      </w:r>
-      <w:r>
-        <w:rPr>
-          <w:rFonts w:ascii="Arial" w:hAnsi="Arial" w:cs="Arial"/>
-          <w:bCs/>
-        </w:rPr>
-        <w:instrText>sequences</w:instrText>
-      </w:r>
-      <w:r>
-        <w:rPr>
-          <w:rFonts w:ascii="Arial" w:hAnsi="Arial" w:cs="Arial"/>
-          <w:bCs/>
-        </w:rPr>
-        <w:fldChar w:fldCharType="end"/>
+        <w:t>sequences}</w:t>
       </w:r>
     </w:p>
     <w:tbl>
@@ -10014,23 +8685,7 @@
                 <w:b/>
                 <w:bCs/>
               </w:rPr>
-              <w:fldChar w:fldCharType="begin"/>
-            </w:r>
-            <w:r>
-              <w:rPr>
-                <w:rFonts w:ascii="Arial" w:hAnsi="Arial" w:cs="Arial"/>
-                <w:b/>
-                <w:bCs/>
-              </w:rPr>
-              <w:instrText>m: seq.name</w:instrText>
-            </w:r>
-            <w:r>
-              <w:rPr>
-                <w:rFonts w:ascii="Arial" w:hAnsi="Arial" w:cs="Arial"/>
-                <w:b/>
-                <w:bCs/>
-              </w:rPr>
-              <w:fldChar w:fldCharType="end"/>
+              <w:t>{m: seq.name}</w:t>
             </w:r>
           </w:p>
         </w:tc>
@@ -10080,28 +8735,14 @@
                 <w:rFonts w:ascii="Arial" w:hAnsi="Arial" w:cs="Arial"/>
                 <w:bCs/>
               </w:rPr>
-              <w:fldChar w:fldCharType="begin"/>
-            </w:r>
-            <w:r>
-              <w:rPr>
-                <w:rFonts w:ascii="Arial" w:hAnsi="Arial" w:cs="Arial"/>
-                <w:bCs/>
-              </w:rPr>
-              <w:instrText>m:</w:instrText>
-            </w:r>
-            <w:r>
-              <w:rPr>
-                <w:rFonts w:ascii="Arial" w:hAnsi="Arial" w:cs="Arial"/>
-                <w:bCs/>
-              </w:rPr>
-              <w:instrText xml:space="preserve"> seq.comments</w:instrText>
-            </w:r>
-            <w:r>
-              <w:rPr>
-                <w:rFonts w:ascii="Arial" w:hAnsi="Arial" w:cs="Arial"/>
-                <w:bCs/>
-              </w:rPr>
-              <w:fldChar w:fldCharType="end"/>
+              <w:t>{m:</w:t>
+            </w:r>
+            <w:r>
+              <w:rPr>
+                <w:rFonts w:ascii="Arial" w:hAnsi="Arial" w:cs="Arial"/>
+                <w:bCs/>
+              </w:rPr>
+              <w:t xml:space="preserve"> seq.comments}</w:t>
             </w:r>
           </w:p>
         </w:tc>
@@ -10151,28 +8792,14 @@
                 <w:rFonts w:ascii="Arial" w:hAnsi="Arial" w:cs="Arial"/>
                 <w:bCs/>
               </w:rPr>
-              <w:fldChar w:fldCharType="begin"/>
-            </w:r>
-            <w:r>
-              <w:rPr>
-                <w:rFonts w:ascii="Arial" w:hAnsi="Arial" w:cs="Arial"/>
-                <w:bCs/>
-              </w:rPr>
-              <w:instrText>m:</w:instrText>
-            </w:r>
-            <w:r>
-              <w:rPr>
-                <w:rFonts w:ascii="Arial" w:hAnsi="Arial" w:cs="Arial"/>
-                <w:bCs/>
-              </w:rPr>
-              <w:instrText xml:space="preserve"> seq.start</w:instrText>
-            </w:r>
-            <w:r>
-              <w:rPr>
-                <w:rFonts w:ascii="Arial" w:hAnsi="Arial" w:cs="Arial"/>
-                <w:bCs/>
-              </w:rPr>
-              <w:fldChar w:fldCharType="end"/>
+              <w:t>{m:</w:t>
+            </w:r>
+            <w:r>
+              <w:rPr>
+                <w:rFonts w:ascii="Arial" w:hAnsi="Arial" w:cs="Arial"/>
+                <w:bCs/>
+              </w:rPr>
+              <w:t xml:space="preserve"> seq.start}</w:t>
             </w:r>
           </w:p>
         </w:tc>
@@ -10222,28 +8849,14 @@
                 <w:rFonts w:ascii="Arial" w:hAnsi="Arial" w:cs="Arial"/>
                 <w:bCs/>
               </w:rPr>
-              <w:fldChar w:fldCharType="begin"/>
-            </w:r>
-            <w:r>
-              <w:rPr>
-                <w:rFonts w:ascii="Arial" w:hAnsi="Arial" w:cs="Arial"/>
-                <w:bCs/>
-              </w:rPr>
-              <w:instrText>m:</w:instrText>
-            </w:r>
-            <w:r>
-              <w:rPr>
-                <w:rFonts w:ascii="Arial" w:hAnsi="Arial" w:cs="Arial"/>
-                <w:bCs/>
-              </w:rPr>
-              <w:instrText xml:space="preserve"> seq.minValue</w:instrText>
-            </w:r>
-            <w:r>
-              <w:rPr>
-                <w:rFonts w:ascii="Arial" w:hAnsi="Arial" w:cs="Arial"/>
-                <w:bCs/>
-              </w:rPr>
-              <w:fldChar w:fldCharType="end"/>
+              <w:t>{m:</w:t>
+            </w:r>
+            <w:r>
+              <w:rPr>
+                <w:rFonts w:ascii="Arial" w:hAnsi="Arial" w:cs="Arial"/>
+                <w:bCs/>
+              </w:rPr>
+              <w:t xml:space="preserve"> seq.minValue}</w:t>
             </w:r>
           </w:p>
         </w:tc>
@@ -10293,28 +8906,14 @@
                 <w:rFonts w:ascii="Arial" w:hAnsi="Arial" w:cs="Arial"/>
                 <w:bCs/>
               </w:rPr>
-              <w:fldChar w:fldCharType="begin"/>
-            </w:r>
-            <w:r>
-              <w:rPr>
-                <w:rFonts w:ascii="Arial" w:hAnsi="Arial" w:cs="Arial"/>
-                <w:bCs/>
-              </w:rPr>
-              <w:instrText>m:</w:instrText>
-            </w:r>
-            <w:r>
-              <w:rPr>
-                <w:rFonts w:ascii="Arial" w:hAnsi="Arial" w:cs="Arial"/>
-                <w:bCs/>
-              </w:rPr>
-              <w:instrText xml:space="preserve"> seq.maxValue</w:instrText>
-            </w:r>
-            <w:r>
-              <w:rPr>
-                <w:rFonts w:ascii="Arial" w:hAnsi="Arial" w:cs="Arial"/>
-                <w:bCs/>
-              </w:rPr>
-              <w:fldChar w:fldCharType="end"/>
+              <w:t>{m:</w:t>
+            </w:r>
+            <w:r>
+              <w:rPr>
+                <w:rFonts w:ascii="Arial" w:hAnsi="Arial" w:cs="Arial"/>
+                <w:bCs/>
+              </w:rPr>
+              <w:t xml:space="preserve"> seq.maxValue}</w:t>
             </w:r>
           </w:p>
         </w:tc>
@@ -10364,28 +8963,14 @@
                 <w:rFonts w:ascii="Arial" w:hAnsi="Arial" w:cs="Arial"/>
                 <w:bCs/>
               </w:rPr>
-              <w:fldChar w:fldCharType="begin"/>
-            </w:r>
-            <w:r>
-              <w:rPr>
-                <w:rFonts w:ascii="Arial" w:hAnsi="Arial" w:cs="Arial"/>
-                <w:bCs/>
-              </w:rPr>
-              <w:instrText>m:</w:instrText>
-            </w:r>
-            <w:r>
-              <w:rPr>
-                <w:rFonts w:ascii="Arial" w:hAnsi="Arial" w:cs="Arial"/>
-                <w:bCs/>
-              </w:rPr>
-              <w:instrText xml:space="preserve"> seq.cacheSize</w:instrText>
-            </w:r>
-            <w:r>
-              <w:rPr>
-                <w:rFonts w:ascii="Arial" w:hAnsi="Arial" w:cs="Arial"/>
-                <w:bCs/>
-              </w:rPr>
-              <w:fldChar w:fldCharType="end"/>
+              <w:t>{m:</w:t>
+            </w:r>
+            <w:r>
+              <w:rPr>
+                <w:rFonts w:ascii="Arial" w:hAnsi="Arial" w:cs="Arial"/>
+                <w:bCs/>
+              </w:rPr>
+              <w:t xml:space="preserve"> seq.cacheSize}</w:t>
             </w:r>
           </w:p>
         </w:tc>
@@ -10435,28 +9020,14 @@
                 <w:rFonts w:ascii="Arial" w:hAnsi="Arial" w:cs="Arial"/>
                 <w:bCs/>
               </w:rPr>
-              <w:fldChar w:fldCharType="begin"/>
-            </w:r>
-            <w:r>
-              <w:rPr>
-                <w:rFonts w:ascii="Arial" w:hAnsi="Arial" w:cs="Arial"/>
-                <w:bCs/>
-              </w:rPr>
-              <w:instrText>m:</w:instrText>
-            </w:r>
-            <w:r>
-              <w:rPr>
-                <w:rFonts w:ascii="Arial" w:hAnsi="Arial" w:cs="Arial"/>
-                <w:bCs/>
-              </w:rPr>
-              <w:instrText xml:space="preserve"> seq.increment</w:instrText>
-            </w:r>
-            <w:r>
-              <w:rPr>
-                <w:rFonts w:ascii="Arial" w:hAnsi="Arial" w:cs="Arial"/>
-                <w:bCs/>
-              </w:rPr>
-              <w:fldChar w:fldCharType="end"/>
+              <w:t>{m:</w:t>
+            </w:r>
+            <w:r>
+              <w:rPr>
+                <w:rFonts w:ascii="Arial" w:hAnsi="Arial" w:cs="Arial"/>
+                <w:bCs/>
+              </w:rPr>
+              <w:t xml:space="preserve"> seq.increment}</w:t>
             </w:r>
           </w:p>
         </w:tc>
@@ -10506,28 +9077,14 @@
                 <w:rFonts w:ascii="Arial" w:hAnsi="Arial" w:cs="Arial"/>
                 <w:bCs/>
               </w:rPr>
-              <w:fldChar w:fldCharType="begin"/>
-            </w:r>
-            <w:r>
-              <w:rPr>
-                <w:rFonts w:ascii="Arial" w:hAnsi="Arial" w:cs="Arial"/>
-                <w:bCs/>
-              </w:rPr>
-              <w:instrText>m:</w:instrText>
-            </w:r>
-            <w:r>
-              <w:rPr>
-                <w:rFonts w:ascii="Arial" w:hAnsi="Arial" w:cs="Arial"/>
-                <w:bCs/>
-              </w:rPr>
-              <w:instrText xml:space="preserve"> seq.cycle</w:instrText>
-            </w:r>
-            <w:r>
-              <w:rPr>
-                <w:rFonts w:ascii="Arial" w:hAnsi="Arial" w:cs="Arial"/>
-                <w:bCs/>
-              </w:rPr>
-              <w:fldChar w:fldCharType="end"/>
+              <w:t>{m:</w:t>
+            </w:r>
+            <w:r>
+              <w:rPr>
+                <w:rFonts w:ascii="Arial" w:hAnsi="Arial" w:cs="Arial"/>
+                <w:bCs/>
+              </w:rPr>
+              <w:t xml:space="preserve"> seq.cycle}</w:t>
             </w:r>
             <w:r>
               <w:rPr>
@@ -10541,35 +9098,21 @@
                 <w:rFonts w:ascii="Arial" w:hAnsi="Arial" w:cs="Arial"/>
                 <w:bCs/>
               </w:rPr>
-              <w:fldChar w:fldCharType="begin"/>
-            </w:r>
-            <w:r>
-              <w:rPr>
-                <w:rFonts w:ascii="Arial" w:hAnsi="Arial" w:cs="Arial"/>
-                <w:bCs/>
-              </w:rPr>
-              <w:instrText>m:</w:instrText>
-            </w:r>
-            <w:r>
-              <w:rPr>
-                <w:rFonts w:ascii="Arial" w:hAnsi="Arial" w:cs="Arial"/>
-                <w:bCs/>
-              </w:rPr>
-              <w:instrText xml:space="preserve"> seq.isCycle</w:instrText>
-            </w:r>
-            <w:r>
-              <w:rPr>
-                <w:rFonts w:ascii="Arial" w:hAnsi="Arial" w:cs="Arial"/>
-                <w:bCs/>
-              </w:rPr>
-              <w:instrText>()</w:instrText>
-            </w:r>
-            <w:r>
-              <w:rPr>
-                <w:rFonts w:ascii="Arial" w:hAnsi="Arial" w:cs="Arial"/>
-                <w:bCs/>
-              </w:rPr>
-              <w:fldChar w:fldCharType="end"/>
+              <w:t>{m:</w:t>
+            </w:r>
+            <w:r>
+              <w:rPr>
+                <w:rFonts w:ascii="Arial" w:hAnsi="Arial" w:cs="Arial"/>
+                <w:bCs/>
+              </w:rPr>
+              <w:t xml:space="preserve"> seq.isCycle</w:t>
+            </w:r>
+            <w:r>
+              <w:rPr>
+                <w:rFonts w:ascii="Arial" w:hAnsi="Arial" w:cs="Arial"/>
+                <w:bCs/>
+              </w:rPr>
+              <w:t>()}</w:t>
             </w:r>
             <w:r>
               <w:rPr>
@@ -10583,28 +9126,14 @@
                 <w:rFonts w:ascii="Arial" w:hAnsi="Arial" w:cs="Arial"/>
                 <w:bCs/>
               </w:rPr>
-              <w:fldChar w:fldCharType="begin"/>
-            </w:r>
-            <w:r>
-              <w:rPr>
-                <w:rFonts w:ascii="Arial" w:hAnsi="Arial" w:cs="Arial"/>
-                <w:bCs/>
-              </w:rPr>
-              <w:instrText>m:</w:instrText>
-            </w:r>
-            <w:r>
-              <w:rPr>
-                <w:rFonts w:ascii="Arial" w:hAnsi="Arial" w:cs="Arial"/>
-                <w:bCs/>
-              </w:rPr>
-              <w:instrText xml:space="preserve"> seq.checkCycle()</w:instrText>
-            </w:r>
-            <w:r>
-              <w:rPr>
-                <w:rFonts w:ascii="Arial" w:hAnsi="Arial" w:cs="Arial"/>
-                <w:bCs/>
-              </w:rPr>
-              <w:fldChar w:fldCharType="end"/>
+              <w:t>{m:</w:t>
+            </w:r>
+            <w:r>
+              <w:rPr>
+                <w:rFonts w:ascii="Arial" w:hAnsi="Arial" w:cs="Arial"/>
+                <w:bCs/>
+              </w:rPr>
+              <w:t xml:space="preserve"> seq.checkCycle()}</w:t>
             </w:r>
           </w:p>
         </w:tc>
@@ -10654,21 +9183,7 @@
                 <w:rFonts w:ascii="Arial" w:hAnsi="Arial" w:cs="Arial"/>
                 <w:bCs/>
               </w:rPr>
-              <w:fldChar w:fldCharType="begin"/>
-            </w:r>
-            <w:r>
-              <w:rPr>
-                <w:rFonts w:ascii="Arial" w:hAnsi="Arial" w:cs="Arial"/>
-                <w:bCs/>
-              </w:rPr>
-              <w:instrText>m:seq.columns.name</w:instrText>
-            </w:r>
-            <w:r>
-              <w:rPr>
-                <w:rFonts w:ascii="Arial" w:hAnsi="Arial" w:cs="Arial"/>
-                <w:bCs/>
-              </w:rPr>
-              <w:fldChar w:fldCharType="end"/>
+              <w:t>{m:seq.columns.name}</w:t>
             </w:r>
           </w:p>
         </w:tc>
@@ -10690,21 +9205,7 @@
           <w:rFonts w:ascii="Arial" w:hAnsi="Arial" w:cs="Arial"/>
           <w:bCs/>
         </w:rPr>
-        <w:fldChar w:fldCharType="begin"/>
-      </w:r>
-      <w:r>
-        <w:rPr>
-          <w:rFonts w:ascii="Arial" w:hAnsi="Arial" w:cs="Arial"/>
-          <w:bCs/>
-        </w:rPr>
-        <w:instrText>m:endfor</w:instrText>
-      </w:r>
-      <w:r>
-        <w:rPr>
-          <w:rFonts w:ascii="Arial" w:hAnsi="Arial" w:cs="Arial"/>
-          <w:bCs/>
-        </w:rPr>
-        <w:fldChar w:fldCharType="end"/>
+        <w:t>{m:endfor}</w:t>
       </w:r>
     </w:p>
     <w:p>
@@ -10714,16 +9215,10 @@
         <w:spacing w:after="200" w:line="276" w:lineRule="auto"/>
       </w:pPr>
       <w:r>
-        <w:fldChar w:fldCharType="begin"/>
-      </w:r>
-      <w:r>
-        <w:instrText>m</w:instrText>
-      </w:r>
-      <w:r>
-        <w:instrText>:endfor</w:instrText>
-      </w:r>
-      <w:r>
-        <w:fldChar w:fldCharType="end"/>
+        <w:t>{m</w:t>
+      </w:r>
+      <w:r>
+        <w:t>:endfor}</w:t>
       </w:r>
     </w:p>
     <w:sectPr>
@@ -10851,13 +9346,7 @@
       <w:tab/>
     </w:r>
     <w:r>
-      <w:fldChar w:fldCharType="begin"/>
-    </w:r>
-    <w:r>
-      <w:instrText>m:db.name</w:instrText>
-    </w:r>
-    <w:r>
-      <w:fldChar w:fldCharType="end"/>
+      <w:t>{m:db.name}</w:t>
     </w:r>
   </w:p>
 </w:hdr>

</xml_diff>